<commit_message>
Update the project framework
</commit_message>
<xml_diff>
--- a/doc/论文协作智能体开发项目计划.docx
+++ b/doc/论文协作智能体开发项目计划.docx
@@ -1,71 +1,90 @@
 
 <file path=word/document.xml><?xml version="1.0" encoding="utf-8"?>
-<w:document xmlns:wpc="http://schemas.microsoft.com/office/word/2010/wordprocessingCanvas" xmlns:cx="http://schemas.microsoft.com/office/drawing/2014/chartex" xmlns:cx1="http://schemas.microsoft.com/office/drawing/2015/9/8/chartex" xmlns:cx2="http://schemas.microsoft.com/office/drawing/2015/10/21/chartex" xmlns:cx3="http://schemas.microsoft.com/office/drawing/2016/5/9/chartex" xmlns:cx4="http://schemas.microsoft.com/office/drawing/2016/5/10/chartex" xmlns:cx5="http://schemas.microsoft.com/office/drawing/2016/5/11/chartex" xmlns:cx6="http://schemas.microsoft.com/office/drawing/2016/5/12/chartex" xmlns:cx7="http://schemas.microsoft.com/office/drawing/2016/5/13/chartex" xmlns:cx8="http://schemas.microsoft.com/office/drawing/2016/5/14/chartex" xmlns:mc="http://schemas.openxmlformats.org/markup-compatibility/2006" xmlns:aink="http://schemas.microsoft.com/office/drawing/2016/ink" xmlns:am3d="http://schemas.microsoft.com/office/drawing/2017/model3d" xmlns:o="urn:schemas-microsoft-com:office:office" xmlns:oel="http://schemas.microsoft.com/office/2019/extlst" xmlns:r="http://schemas.openxmlformats.org/officeDocument/2006/relationships" xmlns:m="http://schemas.openxmlformats.org/officeDocument/2006/math" xmlns:v="urn:schemas-microsoft-com:vml" xmlns:wp14="http://schemas.microsoft.com/office/word/2010/wordprocessingDrawing" xmlns:wp="http://schemas.openxmlformats.org/drawingml/2006/wordprocessingDrawing" xmlns:w10="urn:schemas-microsoft-com:office:word" xmlns:w="http://schemas.openxmlformats.org/wordprocessingml/2006/main" xmlns:w14="http://schemas.microsoft.com/office/word/2010/wordml" xmlns:w15="http://schemas.microsoft.com/office/word/2012/wordml" xmlns:w16cex="http://schemas.microsoft.com/office/word/2018/wordml/cex" xmlns:w16cid="http://schemas.microsoft.com/office/word/2016/wordml/cid" xmlns:w16="http://schemas.microsoft.com/office/word/2018/wordml" xmlns:w16du="http://schemas.microsoft.com/office/word/2023/wordml/word16du" xmlns:w16sdtdh="http://schemas.microsoft.com/office/word/2020/wordml/sdtdatahash" xmlns:w16sdtfl="http://schemas.microsoft.com/office/word/2024/wordml/sdtformatlock" xmlns:w16se="http://schemas.microsoft.com/office/word/2015/wordml/symex" xmlns:wpg="http://schemas.microsoft.com/office/word/2010/wordprocessingGroup" xmlns:wpi="http://schemas.microsoft.com/office/word/2010/wordprocessingInk" xmlns:wne="http://schemas.microsoft.com/office/word/2006/wordml" xmlns:wps="http://schemas.microsoft.com/office/word/2010/wordprocessingShape" mc:Ignorable="w14 w15 w16se w16cid w16 w16cex w16sdtdh w16sdtfl w16du wp14">
+<w:document xmlns:wpc="http://schemas.microsoft.com/office/word/2010/wordprocessingCanvas" xmlns:cx="http://schemas.microsoft.com/office/drawing/2014/chartex" xmlns:cx1="http://schemas.microsoft.com/office/drawing/2015/9/8/chartex" xmlns:cx2="http://schemas.microsoft.com/office/drawing/2015/10/21/chartex" xmlns:cx3="http://schemas.microsoft.com/office/drawing/2016/5/9/chartex" xmlns:cx4="http://schemas.microsoft.com/office/drawing/2016/5/10/chartex" xmlns:cx5="http://schemas.microsoft.com/office/drawing/2016/5/11/chartex" xmlns:cx6="http://schemas.microsoft.com/office/drawing/2016/5/12/chartex" xmlns:cx7="http://schemas.microsoft.com/office/drawing/2016/5/13/chartex" xmlns:cx8="http://schemas.microsoft.com/office/drawing/2016/5/14/chartex" xmlns:mc="http://schemas.openxmlformats.org/markup-compatibility/2006" xmlns:aink="http://schemas.microsoft.com/office/drawing/2016/ink" xmlns:am3d="http://schemas.microsoft.com/office/drawing/2017/model3d" xmlns:o="urn:schemas-microsoft-com:office:office" xmlns:oel="http://schemas.microsoft.com/office/2019/extlst" xmlns:r="http://schemas.openxmlformats.org/officeDocument/2006/relationships" xmlns:m="http://schemas.openxmlformats.org/officeDocument/2006/math" xmlns:v="urn:schemas-microsoft-com:vml" xmlns:wp14="http://schemas.microsoft.com/office/word/2010/wordprocessingDrawing" xmlns:wp="http://schemas.openxmlformats.org/drawingml/2006/wordprocessingDrawing" xmlns:w10="urn:schemas-microsoft-com:office:word" xmlns:w="http://schemas.openxmlformats.org/wordprocessingml/2006/main" xmlns:w14="http://schemas.microsoft.com/office/word/2010/wordml" xmlns:w15="http://schemas.microsoft.com/office/word/2012/wordml" xmlns:w16cex="http://schemas.microsoft.com/office/word/2018/wordml/cex" xmlns:w16cid="http://schemas.microsoft.com/office/word/2016/wordml/cid" xmlns:w16="http://schemas.microsoft.com/office/word/2018/wordml" xmlns:w16sdtdh="http://schemas.microsoft.com/office/word/2020/wordml/sdtdatahash" xmlns:w16se="http://schemas.microsoft.com/office/word/2015/wordml/symex" xmlns:wpg="http://schemas.microsoft.com/office/word/2010/wordprocessingGroup" xmlns:wpi="http://schemas.microsoft.com/office/word/2010/wordprocessingInk" xmlns:wne="http://schemas.microsoft.com/office/word/2006/wordml" xmlns:wps="http://schemas.microsoft.com/office/word/2010/wordprocessingShape" mc:Ignorable="w14 w15 w16se w16cid w16 w16cex w16sdtdh wp14">
   <w:body>
     <w:p>
+      <w:pPr>
+        <w:rPr>
+          <w:rFonts w:hint="eastAsia"/>
+        </w:rPr>
+      </w:pPr>
       <w:r>
         <w:pict w14:anchorId="6ACD60E0">
-          <v:rect id="_x0000_i1067" style="width:0;height:1.5pt" o:hralign="center" o:hrstd="t" o:hrnoshade="t" o:hr="t" fillcolor="gray" stroked="f"/>
+          <v:rect id="_x0000_i1025" style="width:0;height:1.5pt" o:hralign="center" o:hrstd="t" o:hrnoshade="t" o:hr="t" fillcolor="gray" stroked="f"/>
         </w:pict>
       </w:r>
     </w:p>
     <w:p>
-      <w:r>
-        <w:rPr>
-          <w:rFonts w:ascii="Segoe UI Emoji" w:hAnsi="Segoe UI Emoji" w:cs="Segoe UI Emoji"/>
+      <w:pPr>
+        <w:rPr>
+          <w:rFonts w:hint="eastAsia"/>
+        </w:rPr>
+      </w:pPr>
+      <w:r>
+        <w:rPr>
           <w:b/>
           <w:bCs/>
         </w:rPr>
-        <w:t>📜</w:t>
-      </w:r>
-      <w:r>
-        <w:rPr>
+        <w:t>论文协作智能体开发项目计划</w:t>
+      </w:r>
+    </w:p>
+    <w:p>
+      <w:pPr>
+        <w:rPr>
+          <w:rFonts w:hint="eastAsia"/>
+        </w:rPr>
+      </w:pPr>
+      <w:r>
+        <w:pict w14:anchorId="640A64D6">
+          <v:rect id="_x0000_i1026" style="width:0;height:1.5pt" o:hralign="center" o:hrstd="t" o:hrnoshade="t" o:hr="t" fillcolor="gray" stroked="f"/>
+        </w:pict>
+      </w:r>
+    </w:p>
+    <w:p>
+      <w:pPr>
+        <w:rPr>
+          <w:rFonts w:hint="eastAsia"/>
           <w:b/>
           <w:bCs/>
         </w:rPr>
-        <w:t xml:space="preserve"> 论文协作智能体开发项目计划</w:t>
-      </w:r>
-    </w:p>
-    <w:p>
-      <w:r>
-        <w:pict w14:anchorId="640A64D6">
-          <v:rect id="_x0000_i1068" style="width:0;height:1.5pt" o:hralign="center" o:hrstd="t" o:hrnoshade="t" o:hr="t" fillcolor="gray" stroked="f"/>
-        </w:pict>
-      </w:r>
-    </w:p>
-    <w:p>
-      <w:pPr>
+      </w:pPr>
+      <w:r>
         <w:rPr>
           <w:b/>
           <w:bCs/>
         </w:rPr>
-      </w:pPr>
-      <w:r>
-        <w:rPr>
-          <w:b/>
-          <w:bCs/>
-        </w:rPr>
         <w:t>一、 项目任务与需求定义</w:t>
       </w:r>
     </w:p>
     <w:p>
-      <w:r>
-        <w:t>本项目旨在构建一个基于多推理框架的</w:t>
-      </w:r>
-      <w:r>
-        <w:rPr>
-          <w:b/>
-          <w:bCs/>
-        </w:rPr>
-        <w:t>论文写作增强系统</w:t>
-      </w:r>
-      <w:r>
-        <w:t>，通过集成四种 Agent 架构，解决学术写作中从选题到格式调优的全流程痛点。</w:t>
-      </w:r>
-    </w:p>
-    <w:p>
-      <w:pPr>
-        <w:rPr>
+      <w:pPr>
+        <w:rPr>
+          <w:rFonts w:hint="eastAsia"/>
+        </w:rPr>
+      </w:pPr>
+      <w:r>
+        <w:t>本项目旨在构建一个基于多智能体架构的论文写作增强系统。项目以四种基础 Agent 为起点，演进为集成了智能动态路由、RAG长期记忆与协同机制的系统。系统覆盖从文献检索、数据可视化到 LaTeX 结构化调优的学术写作全流程，打造兼顾严谨科研辅助与人性化陪伴的智能</w:t>
+      </w:r>
+      <w:r>
+        <w:rPr>
+          <w:rFonts w:hint="eastAsia"/>
+        </w:rPr>
+        <w:t>辅助论文</w:t>
+      </w:r>
+      <w:r>
+        <w:t>写作工具</w:t>
+      </w:r>
+      <w:r>
+        <w:rPr>
+          <w:rFonts w:hint="eastAsia"/>
+        </w:rPr>
+        <w:t>。</w:t>
+      </w:r>
+    </w:p>
+    <w:p>
+      <w:pPr>
+        <w:rPr>
+          <w:rFonts w:hint="eastAsia"/>
           <w:b/>
           <w:bCs/>
         </w:rPr>
@@ -84,6 +103,9 @@
           <w:ilvl w:val="0"/>
           <w:numId w:val="1"/>
         </w:numPr>
+        <w:rPr>
+          <w:rFonts w:hint="eastAsia"/>
+        </w:rPr>
       </w:pPr>
       <w:r>
         <w:rPr>
@@ -102,6 +124,9 @@
           <w:ilvl w:val="0"/>
           <w:numId w:val="1"/>
         </w:numPr>
+        <w:rPr>
+          <w:rFonts w:hint="eastAsia"/>
+        </w:rPr>
       </w:pPr>
       <w:r>
         <w:rPr>
@@ -120,6 +145,9 @@
           <w:ilvl w:val="0"/>
           <w:numId w:val="1"/>
         </w:numPr>
+        <w:rPr>
+          <w:rFonts w:hint="eastAsia"/>
+        </w:rPr>
       </w:pPr>
       <w:r>
         <w:rPr>
@@ -138,6 +166,9 @@
           <w:ilvl w:val="0"/>
           <w:numId w:val="1"/>
         </w:numPr>
+        <w:rPr>
+          <w:rFonts w:hint="eastAsia"/>
+        </w:rPr>
       </w:pPr>
       <w:r>
         <w:rPr>
@@ -156,43 +187,392 @@
           <w:ilvl w:val="0"/>
           <w:numId w:val="1"/>
         </w:numPr>
+        <w:rPr>
+          <w:rFonts w:hint="eastAsia"/>
+        </w:rPr>
       </w:pPr>
       <w:r>
         <w:rPr>
           <w:b/>
           <w:bCs/>
         </w:rPr>
-        <w:t>论文格式优化</w:t>
-      </w:r>
-      <w:r>
-        <w:t>：识别 LaTeX 源码中的语法错误、润色表达。</w:t>
-      </w:r>
-    </w:p>
-    <w:p>
-      <w:r>
-        <w:pict w14:anchorId="7DCB627F">
-          <v:rect id="_x0000_i1069" style="width:0;height:1.5pt" o:hralign="center" o:hrstd="t" o:hrnoshade="t" o:hr="t" fillcolor="gray" stroked="f"/>
-        </w:pict>
-      </w:r>
-    </w:p>
-    <w:p>
-      <w:pPr>
-        <w:rPr>
+        <w:t>论文</w:t>
+      </w:r>
+      <w:r>
+        <w:rPr>
+          <w:rFonts w:hint="eastAsia"/>
           <w:b/>
           <w:bCs/>
         </w:rPr>
-      </w:pPr>
+        <w:t>结构理解与</w:t>
+      </w:r>
       <w:r>
         <w:rPr>
           <w:b/>
           <w:bCs/>
         </w:rPr>
+        <w:t>格式优化</w:t>
+      </w:r>
+      <w:r>
+        <w:t>：识别 LaTeX 源码中的语法错误、润色表达</w:t>
+      </w:r>
+      <w:r>
+        <w:rPr>
+          <w:rFonts w:hint="eastAsia"/>
+        </w:rPr>
+        <w:t>；深入理解LaTeX代码结构，提供整体上下文逻辑连贯的、结构性规范的优化建议。</w:t>
+      </w:r>
+    </w:p>
+    <w:p>
+      <w:pPr>
+        <w:numPr>
+          <w:ilvl w:val="0"/>
+          <w:numId w:val="1"/>
+        </w:numPr>
+        <w:rPr>
+          <w:rFonts w:hint="eastAsia"/>
+        </w:rPr>
+      </w:pPr>
+      <w:r>
+        <w:rPr>
+          <w:rFonts w:hint="eastAsia"/>
+          <w:b/>
+          <w:bCs/>
+        </w:rPr>
+        <w:t>整理论文思路</w:t>
+      </w:r>
+      <w:r>
+        <w:rPr>
+          <w:rFonts w:hint="eastAsia"/>
+        </w:rPr>
+        <w:t>：根据user给出的主题，要求以及</w:t>
+      </w:r>
+      <w:r>
+        <w:rPr>
+          <w:rFonts w:hint="eastAsia"/>
+        </w:rPr>
+        <w:t>和memory，专家库结合</w:t>
+      </w:r>
+      <w:r>
+        <w:rPr>
+          <w:rFonts w:hint="eastAsia"/>
+        </w:rPr>
+        <w:t>为user进行一个整篇/某一章节的写作思路</w:t>
+      </w:r>
+      <w:r>
+        <w:rPr>
+          <w:rFonts w:hint="eastAsia"/>
+        </w:rPr>
+        <w:t>。</w:t>
+      </w:r>
+    </w:p>
+    <w:p>
+      <w:pPr>
+        <w:numPr>
+          <w:ilvl w:val="0"/>
+          <w:numId w:val="1"/>
+        </w:numPr>
+        <w:rPr>
+          <w:rFonts w:hint="eastAsia"/>
+        </w:rPr>
+      </w:pPr>
+      <w:r>
+        <w:rPr>
+          <w:rFonts w:hint="eastAsia"/>
+          <w:b/>
+          <w:bCs/>
+        </w:rPr>
+        <w:t>图像生成</w:t>
+      </w:r>
+      <w:r>
+        <w:rPr>
+          <w:rFonts w:hint="eastAsia"/>
+        </w:rPr>
+        <w:t>：接入DALL/Stable diffusionAPI，对于用户在论文写作中可能遇到的精确需求图像，流程图，云图</w:t>
+      </w:r>
+      <w:r>
+        <w:rPr>
+          <w:rFonts w:hint="eastAsia"/>
+        </w:rPr>
+        <w:t>，或用户自定义prompt</w:t>
+      </w:r>
+      <w:r>
+        <w:rPr>
+          <w:rFonts w:hint="eastAsia"/>
+        </w:rPr>
+        <w:t>等进行图像生成</w:t>
+      </w:r>
+      <w:r>
+        <w:rPr>
+          <w:rFonts w:hint="eastAsia"/>
+        </w:rPr>
+        <w:t>。</w:t>
+      </w:r>
+    </w:p>
+    <w:p>
+      <w:pPr>
+        <w:numPr>
+          <w:ilvl w:val="0"/>
+          <w:numId w:val="1"/>
+        </w:numPr>
+      </w:pPr>
+      <w:r>
+        <w:rPr>
+          <w:rFonts w:hint="eastAsia"/>
+          <w:b/>
+          <w:bCs/>
+        </w:rPr>
+        <w:t>建立资源库</w:t>
+      </w:r>
+      <w:r>
+        <w:rPr>
+          <w:rFonts w:hint="eastAsia"/>
+        </w:rPr>
+        <w:t>：建立多节点多类别RAG，包括检索论文资料库，专家经验知识库，用户自定义资源库等等，提高agent</w:t>
+      </w:r>
+      <w:r>
+        <w:rPr>
+          <w:rFonts w:hint="eastAsia"/>
+        </w:rPr>
+        <w:t>理解能力与任务完成质量</w:t>
+      </w:r>
+      <w:r>
+        <w:rPr>
+          <w:rFonts w:hint="eastAsia"/>
+        </w:rPr>
+        <w:t>。</w:t>
+      </w:r>
+    </w:p>
+    <w:p>
+      <w:pPr>
+        <w:numPr>
+          <w:ilvl w:val="0"/>
+          <w:numId w:val="1"/>
+        </w:numPr>
+        <w:rPr>
+          <w:rFonts w:hint="eastAsia"/>
+        </w:rPr>
+      </w:pPr>
+      <w:r>
+        <w:rPr>
+          <w:rFonts w:hint="eastAsia"/>
+          <w:b/>
+          <w:bCs/>
+        </w:rPr>
+        <w:t>多分支上下文：建立多分支上下文管理机制，类似于git的不同branch，允许不同branch有不同的上下文记忆和共用的上下文记忆，允许agent的记忆在多个状态之间迁移。面向用户需要中途频繁更改想法，需要可回退的尝试的场景。</w:t>
+      </w:r>
+    </w:p>
+    <w:p>
+      <w:pPr>
+        <w:numPr>
+          <w:ilvl w:val="0"/>
+          <w:numId w:val="1"/>
+        </w:numPr>
+        <w:rPr>
+          <w:rFonts w:hint="eastAsia"/>
+        </w:rPr>
+      </w:pPr>
+      <w:r>
+        <w:rPr>
+          <w:rFonts w:hint="eastAsia"/>
+          <w:b/>
+          <w:bCs/>
+        </w:rPr>
+        <w:t>建立基于路由选择的高效高质量智能体</w:t>
+      </w:r>
+      <w:r>
+        <w:rPr>
+          <w:rFonts w:hint="eastAsia"/>
+        </w:rPr>
+        <w:t>：通过训练模型/使用路由选择agent，针对不同任务选择不同的agent模型，以保证高效与高质量的平衡</w:t>
+      </w:r>
+      <w:r>
+        <w:rPr>
+          <w:rFonts w:hint="eastAsia"/>
+        </w:rPr>
+        <w:t>。</w:t>
+      </w:r>
+    </w:p>
+    <w:p>
+      <w:pPr>
+        <w:numPr>
+          <w:ilvl w:val="0"/>
+          <w:numId w:val="1"/>
+        </w:numPr>
+        <w:rPr>
+          <w:rFonts w:hint="eastAsia"/>
+        </w:rPr>
+      </w:pPr>
+      <w:r>
+        <w:rPr>
+          <w:rFonts w:hint="eastAsia"/>
+          <w:b/>
+          <w:bCs/>
+        </w:rPr>
+        <w:t>自适应路由</w:t>
+      </w:r>
+      <w:r>
+        <w:rPr>
+          <w:rFonts w:hint="eastAsia"/>
+          <w:b/>
+          <w:bCs/>
+        </w:rPr>
+        <w:t>功能</w:t>
+      </w:r>
+      <w:r>
+        <w:rPr>
+          <w:rFonts w:hint="eastAsia"/>
+        </w:rPr>
+        <w:t>：</w:t>
+      </w:r>
+      <w:r>
+        <w:rPr>
+          <w:rFonts w:hint="eastAsia"/>
+        </w:rPr>
+        <w:t>根据用户的输入或偏好以及实际处理的任务难易，自适应地选择合适的模型架构进行工作。</w:t>
+      </w:r>
+    </w:p>
+    <w:p>
+      <w:pPr>
+        <w:numPr>
+          <w:ilvl w:val="0"/>
+          <w:numId w:val="1"/>
+        </w:numPr>
+        <w:rPr>
+          <w:rFonts w:hint="eastAsia"/>
+        </w:rPr>
+      </w:pPr>
+      <w:r>
+        <w:rPr>
+          <w:rFonts w:hint="eastAsia"/>
+          <w:b/>
+          <w:bCs/>
+        </w:rPr>
+        <w:t>建立结构清晰有创造力的MAS</w:t>
+      </w:r>
+      <w:r>
+        <w:rPr>
+          <w:rFonts w:hint="eastAsia"/>
+        </w:rPr>
+        <w:t>：通过设计一个基于</w:t>
+      </w:r>
+      <w:r>
+        <w:t>Planner–Executor 架构</w:t>
+      </w:r>
+      <w:r>
+        <w:rPr>
+          <w:rFonts w:hint="eastAsia"/>
+        </w:rPr>
+        <w:t>的MAS，提高论文协作智能体开发的表现情况</w:t>
+      </w:r>
+      <w:r>
+        <w:rPr>
+          <w:rFonts w:hint="eastAsia"/>
+        </w:rPr>
+        <w:t>。</w:t>
+      </w:r>
+    </w:p>
+    <w:p>
+      <w:pPr>
+        <w:numPr>
+          <w:ilvl w:val="0"/>
+          <w:numId w:val="1"/>
+        </w:numPr>
+        <w:rPr>
+          <w:rFonts w:hint="eastAsia"/>
+        </w:rPr>
+      </w:pPr>
+      <w:r>
+        <w:rPr>
+          <w:rFonts w:hint="eastAsia"/>
+          <w:b/>
+          <w:bCs/>
+        </w:rPr>
+        <w:t>兼具科研工作的严谨与</w:t>
+      </w:r>
+      <w:r>
+        <w:rPr>
+          <w:rFonts w:hint="eastAsia"/>
+          <w:b/>
+          <w:bCs/>
+        </w:rPr>
+        <w:t>人性化</w:t>
+      </w:r>
+      <w:r>
+        <w:rPr>
+          <w:rFonts w:hint="eastAsia"/>
+        </w:rPr>
+        <w:t>：设计agent可以多用过user的对话中体会其情绪状态，适时提出关于心里上的知道建议与情绪价值反馈，它不止是一个工具，更能在user进行科研工作时为他（她）提供情绪价值与陪伴</w:t>
+      </w:r>
+      <w:r>
+        <w:rPr>
+          <w:rFonts w:hint="eastAsia"/>
+        </w:rPr>
+        <w:t>。</w:t>
+      </w:r>
+    </w:p>
+    <w:p>
+      <w:pPr>
+        <w:rPr>
+          <w:rFonts w:hint="eastAsia"/>
+        </w:rPr>
+      </w:pPr>
+      <w:r>
+        <w:pict w14:anchorId="7DCB627F">
+          <v:rect id="_x0000_i1027" style="width:0;height:1.5pt" o:hralign="center" o:hrstd="t" o:hrnoshade="t" o:hr="t" fillcolor="gray" stroked="f"/>
+        </w:pict>
+      </w:r>
+    </w:p>
+    <w:p>
+      <w:pPr>
+        <w:rPr>
+          <w:rFonts w:hint="eastAsia"/>
+          <w:b/>
+          <w:bCs/>
+        </w:rPr>
+      </w:pPr>
+      <w:r>
+        <w:rPr>
+          <w:b/>
+          <w:bCs/>
+        </w:rPr>
         <w:t>二、 团队分工与资源配置</w:t>
       </w:r>
     </w:p>
     <w:p>
-      <w:r>
-        <w:t>本项目采用“一人一框架”的并行开发模式，确保技术多样性与功能模块化。</w:t>
+      <w:pPr>
+        <w:rPr>
+          <w:rFonts w:hint="eastAsia"/>
+          <w:b/>
+          <w:bCs/>
+          <w:sz w:val="22"/>
+          <w:szCs w:val="24"/>
+        </w:rPr>
+      </w:pPr>
+      <w:r>
+        <w:rPr>
+          <w:b/>
+          <w:bCs/>
+          <w:color w:val="47D459" w:themeColor="accent3" w:themeTint="99"/>
+        </w:rPr>
+        <w:t>本项目</w:t>
+      </w:r>
+      <w:r>
+        <w:rPr>
+          <w:rFonts w:hint="eastAsia"/>
+          <w:b/>
+          <w:bCs/>
+          <w:color w:val="47D459" w:themeColor="accent3" w:themeTint="99"/>
+        </w:rPr>
+        <w:t>初期</w:t>
+      </w:r>
+      <w:r>
+        <w:rPr>
+          <w:b/>
+          <w:bCs/>
+          <w:color w:val="47D459" w:themeColor="accent3" w:themeTint="99"/>
+        </w:rPr>
+        <w:t>采用“一人一框架”的并行开发模式，确保技术多样性与功能模块化</w:t>
       </w:r>
     </w:p>
     <w:tbl>
@@ -206,10 +586,10 @@
         <w:tblLook w:val="04A0" w:firstRow="1" w:lastRow="0" w:firstColumn="1" w:lastColumn="0" w:noHBand="0" w:noVBand="1"/>
       </w:tblPr>
       <w:tblGrid>
-        <w:gridCol w:w="679"/>
+        <w:gridCol w:w="1126"/>
         <w:gridCol w:w="2130"/>
-        <w:gridCol w:w="3292"/>
-        <w:gridCol w:w="2189"/>
+        <w:gridCol w:w="2848"/>
+        <w:gridCol w:w="2186"/>
       </w:tblGrid>
       <w:tr>
         <w:trPr>
@@ -218,7 +598,7 @@
         </w:trPr>
         <w:tc>
           <w:tcPr>
-            <w:tcW w:w="0" w:type="auto"/>
+            <w:tcW w:w="1081" w:type="dxa"/>
             <w:tcBorders>
               <w:top w:val="single" w:sz="6" w:space="0" w:color="auto"/>
               <w:left w:val="single" w:sz="6" w:space="0" w:color="auto"/>
@@ -235,6 +615,11 @@
             <w:hideMark/>
           </w:tcPr>
           <w:p>
+            <w:pPr>
+              <w:rPr>
+                <w:rFonts w:hint="eastAsia"/>
+              </w:rPr>
+            </w:pPr>
             <w:r>
               <w:rPr>
                 <w:b/>
@@ -246,7 +631,7 @@
         </w:tc>
         <w:tc>
           <w:tcPr>
-            <w:tcW w:w="0" w:type="auto"/>
+            <w:tcW w:w="2100" w:type="dxa"/>
             <w:tcBorders>
               <w:top w:val="single" w:sz="6" w:space="0" w:color="auto"/>
               <w:left w:val="single" w:sz="6" w:space="0" w:color="auto"/>
@@ -263,6 +648,11 @@
             <w:hideMark/>
           </w:tcPr>
           <w:p>
+            <w:pPr>
+              <w:rPr>
+                <w:rFonts w:hint="eastAsia"/>
+              </w:rPr>
+            </w:pPr>
             <w:r>
               <w:rPr>
                 <w:b/>
@@ -274,7 +664,7 @@
         </w:tc>
         <w:tc>
           <w:tcPr>
-            <w:tcW w:w="0" w:type="auto"/>
+            <w:tcW w:w="2818" w:type="dxa"/>
             <w:tcBorders>
               <w:top w:val="single" w:sz="6" w:space="0" w:color="auto"/>
               <w:left w:val="single" w:sz="6" w:space="0" w:color="auto"/>
@@ -291,6 +681,11 @@
             <w:hideMark/>
           </w:tcPr>
           <w:p>
+            <w:pPr>
+              <w:rPr>
+                <w:rFonts w:hint="eastAsia"/>
+              </w:rPr>
+            </w:pPr>
             <w:r>
               <w:rPr>
                 <w:b/>
@@ -319,6 +714,11 @@
             <w:hideMark/>
           </w:tcPr>
           <w:p>
+            <w:pPr>
+              <w:rPr>
+                <w:rFonts w:hint="eastAsia"/>
+              </w:rPr>
+            </w:pPr>
             <w:r>
               <w:rPr>
                 <w:b/>
@@ -335,7 +735,7 @@
         </w:trPr>
         <w:tc>
           <w:tcPr>
-            <w:tcW w:w="0" w:type="auto"/>
+            <w:tcW w:w="1081" w:type="dxa"/>
             <w:tcBorders>
               <w:top w:val="single" w:sz="6" w:space="0" w:color="auto"/>
               <w:left w:val="single" w:sz="6" w:space="0" w:color="auto"/>
@@ -352,18 +752,24 @@
             <w:hideMark/>
           </w:tcPr>
           <w:p>
+            <w:pPr>
+              <w:rPr>
+                <w:rFonts w:hint="eastAsia"/>
+              </w:rPr>
+            </w:pPr>
             <w:r>
               <w:rPr>
+                <w:rFonts w:hint="eastAsia"/>
                 <w:b/>
                 <w:bCs/>
               </w:rPr>
-              <w:t>组员 A</w:t>
+              <w:t>于天泽</w:t>
             </w:r>
           </w:p>
         </w:tc>
         <w:tc>
           <w:tcPr>
-            <w:tcW w:w="0" w:type="auto"/>
+            <w:tcW w:w="2100" w:type="dxa"/>
             <w:tcBorders>
               <w:top w:val="single" w:sz="6" w:space="0" w:color="auto"/>
               <w:left w:val="single" w:sz="6" w:space="0" w:color="auto"/>
@@ -380,6 +786,11 @@
             <w:hideMark/>
           </w:tcPr>
           <w:p>
+            <w:pPr>
+              <w:rPr>
+                <w:rFonts w:hint="eastAsia"/>
+              </w:rPr>
+            </w:pPr>
             <w:r>
               <w:rPr>
                 <w:b/>
@@ -391,7 +802,7 @@
         </w:tc>
         <w:tc>
           <w:tcPr>
-            <w:tcW w:w="0" w:type="auto"/>
+            <w:tcW w:w="2818" w:type="dxa"/>
             <w:tcBorders>
               <w:top w:val="single" w:sz="6" w:space="0" w:color="auto"/>
               <w:left w:val="single" w:sz="6" w:space="0" w:color="auto"/>
@@ -408,6 +819,11 @@
             <w:hideMark/>
           </w:tcPr>
           <w:p>
+            <w:pPr>
+              <w:rPr>
+                <w:rFonts w:hint="eastAsia"/>
+              </w:rPr>
+            </w:pPr>
             <w:r>
               <w:rPr>
                 <w:b/>
@@ -416,7 +832,11 @@
               <w:t>单次推理模式</w:t>
             </w:r>
             <w:r>
-              <w:t>。直接调用工具完成任务，适合快速响应。</w:t>
+              <w:t>。直接调用工</w:t>
+            </w:r>
+            <w:r>
+              <w:lastRenderedPageBreak/>
+              <w:t>具完成任务，适合快速响应。</w:t>
             </w:r>
           </w:p>
         </w:tc>
@@ -439,8 +859,18 @@
             <w:hideMark/>
           </w:tcPr>
           <w:p>
+            <w:pPr>
+              <w:rPr>
+                <w:rFonts w:hint="eastAsia"/>
+              </w:rPr>
+            </w:pPr>
             <w:r>
-              <w:t>辅助 API 封装与基础 Prompt 生成。</w:t>
+              <w:lastRenderedPageBreak/>
+              <w:t xml:space="preserve">辅助 API 封装与基础 </w:t>
+            </w:r>
+            <w:r>
+              <w:lastRenderedPageBreak/>
+              <w:t>Prompt 生成。</w:t>
             </w:r>
           </w:p>
         </w:tc>
@@ -451,7 +881,7 @@
         </w:trPr>
         <w:tc>
           <w:tcPr>
-            <w:tcW w:w="0" w:type="auto"/>
+            <w:tcW w:w="1081" w:type="dxa"/>
             <w:tcBorders>
               <w:top w:val="single" w:sz="6" w:space="0" w:color="auto"/>
               <w:left w:val="single" w:sz="6" w:space="0" w:color="auto"/>
@@ -468,18 +898,25 @@
             <w:hideMark/>
           </w:tcPr>
           <w:p>
+            <w:pPr>
+              <w:rPr>
+                <w:rFonts w:hint="eastAsia"/>
+              </w:rPr>
+            </w:pPr>
             <w:r>
               <w:rPr>
+                <w:rFonts w:hint="eastAsia"/>
                 <w:b/>
                 <w:bCs/>
               </w:rPr>
-              <w:t>组员 B</w:t>
+              <w:lastRenderedPageBreak/>
+              <w:t>乔雨霖</w:t>
             </w:r>
           </w:p>
         </w:tc>
         <w:tc>
           <w:tcPr>
-            <w:tcW w:w="0" w:type="auto"/>
+            <w:tcW w:w="2100" w:type="dxa"/>
             <w:tcBorders>
               <w:top w:val="single" w:sz="6" w:space="0" w:color="auto"/>
               <w:left w:val="single" w:sz="6" w:space="0" w:color="auto"/>
@@ -496,6 +933,11 @@
             <w:hideMark/>
           </w:tcPr>
           <w:p>
+            <w:pPr>
+              <w:rPr>
+                <w:rFonts w:hint="eastAsia"/>
+              </w:rPr>
+            </w:pPr>
             <w:r>
               <w:rPr>
                 <w:b/>
@@ -507,7 +949,7 @@
         </w:tc>
         <w:tc>
           <w:tcPr>
-            <w:tcW w:w="0" w:type="auto"/>
+            <w:tcW w:w="2818" w:type="dxa"/>
             <w:tcBorders>
               <w:top w:val="single" w:sz="6" w:space="0" w:color="auto"/>
               <w:left w:val="single" w:sz="6" w:space="0" w:color="auto"/>
@@ -524,6 +966,11 @@
             <w:hideMark/>
           </w:tcPr>
           <w:p>
+            <w:pPr>
+              <w:rPr>
+                <w:rFonts w:hint="eastAsia"/>
+              </w:rPr>
+            </w:pPr>
             <w:r>
               <w:rPr>
                 <w:b/>
@@ -555,6 +1002,11 @@
             <w:hideMark/>
           </w:tcPr>
           <w:p>
+            <w:pPr>
+              <w:rPr>
+                <w:rFonts w:hint="eastAsia"/>
+              </w:rPr>
+            </w:pPr>
             <w:r>
               <w:t>协助调试 Reasoning 链路与工具链。</w:t>
             </w:r>
@@ -567,7 +1019,43 @@
         </w:trPr>
         <w:tc>
           <w:tcPr>
-            <w:tcW w:w="0" w:type="auto"/>
+            <w:tcW w:w="1081" w:type="dxa"/>
+            <w:tcBorders>
+              <w:top w:val="single" w:sz="6" w:space="0" w:color="auto"/>
+              <w:left w:val="single" w:sz="6" w:space="0" w:color="auto"/>
+              <w:bottom w:val="single" w:sz="6" w:space="0" w:color="auto"/>
+              <w:right w:val="single" w:sz="6" w:space="0" w:color="auto"/>
+            </w:tcBorders>
+            <w:tcMar>
+              <w:top w:w="240" w:type="dxa"/>
+              <w:left w:w="0" w:type="dxa"/>
+              <w:bottom w:w="240" w:type="dxa"/>
+              <w:right w:w="180" w:type="dxa"/>
+            </w:tcMar>
+            <w:vAlign w:val="center"/>
+            <w:hideMark/>
+          </w:tcPr>
+          <w:p>
+            <w:pPr>
+              <w:rPr>
+                <w:rFonts w:hint="eastAsia"/>
+                <w:b/>
+                <w:bCs/>
+              </w:rPr>
+            </w:pPr>
+            <w:r>
+              <w:rPr>
+                <w:rFonts w:hint="eastAsia"/>
+                <w:b/>
+                <w:bCs/>
+              </w:rPr>
+              <w:t>毛炜翔</w:t>
+            </w:r>
+          </w:p>
+        </w:tc>
+        <w:tc>
+          <w:tcPr>
+            <w:tcW w:w="2100" w:type="dxa"/>
             <w:tcBorders>
               <w:top w:val="single" w:sz="6" w:space="0" w:color="auto"/>
               <w:left w:val="single" w:sz="6" w:space="0" w:color="auto"/>
@@ -591,15 +1079,16 @@
             </w:pPr>
             <w:r>
               <w:rPr>
-                <w:rFonts w:hint="eastAsia"/>
+                <w:b/>
+                <w:bCs/>
               </w:rPr>
-              <w:t>毛炜翔</w:t>
+              <w:t>ReflectionAgent</w:t>
             </w:r>
           </w:p>
         </w:tc>
         <w:tc>
           <w:tcPr>
-            <w:tcW w:w="0" w:type="auto"/>
+            <w:tcW w:w="2818" w:type="dxa"/>
             <w:tcBorders>
               <w:top w:val="single" w:sz="6" w:space="0" w:color="auto"/>
               <w:left w:val="single" w:sz="6" w:space="0" w:color="auto"/>
@@ -616,34 +1105,11 @@
             <w:hideMark/>
           </w:tcPr>
           <w:p>
-            <w:r>
+            <w:pPr>
               <w:rPr>
-                <w:b/>
-                <w:bCs/>
+                <w:rFonts w:hint="eastAsia"/>
               </w:rPr>
-              <w:t>ReflectionAgent</w:t>
-            </w:r>
-          </w:p>
-        </w:tc>
-        <w:tc>
-          <w:tcPr>
-            <w:tcW w:w="0" w:type="auto"/>
-            <w:tcBorders>
-              <w:top w:val="single" w:sz="6" w:space="0" w:color="auto"/>
-              <w:left w:val="single" w:sz="6" w:space="0" w:color="auto"/>
-              <w:bottom w:val="single" w:sz="6" w:space="0" w:color="auto"/>
-              <w:right w:val="single" w:sz="6" w:space="0" w:color="auto"/>
-            </w:tcBorders>
-            <w:tcMar>
-              <w:top w:w="240" w:type="dxa"/>
-              <w:left w:w="0" w:type="dxa"/>
-              <w:bottom w:w="240" w:type="dxa"/>
-              <w:right w:w="180" w:type="dxa"/>
-            </w:tcMar>
-            <w:vAlign w:val="center"/>
-            <w:hideMark/>
-          </w:tcPr>
-          <w:p>
+            </w:pPr>
             <w:r>
               <w:rPr>
                 <w:b/>
@@ -675,6 +1141,11 @@
             <w:hideMark/>
           </w:tcPr>
           <w:p>
+            <w:pPr>
+              <w:rPr>
+                <w:rFonts w:hint="eastAsia"/>
+              </w:rPr>
+            </w:pPr>
             <w:r>
               <w:t>生成对比样本，辅助编写评价准则。</w:t>
             </w:r>
@@ -687,7 +1158,7 @@
         </w:trPr>
         <w:tc>
           <w:tcPr>
-            <w:tcW w:w="0" w:type="auto"/>
+            <w:tcW w:w="1081" w:type="dxa"/>
             <w:tcBorders>
               <w:top w:val="single" w:sz="6" w:space="0" w:color="auto"/>
               <w:left w:val="single" w:sz="6" w:space="0" w:color="auto"/>
@@ -704,18 +1175,26 @@
             <w:hideMark/>
           </w:tcPr>
           <w:p>
-            <w:r>
+            <w:pPr>
               <w:rPr>
+                <w:rFonts w:hint="eastAsia"/>
                 <w:b/>
                 <w:bCs/>
               </w:rPr>
-              <w:t>组员 D</w:t>
+            </w:pPr>
+            <w:r>
+              <w:rPr>
+                <w:rFonts w:hint="eastAsia"/>
+                <w:b/>
+                <w:bCs/>
+              </w:rPr>
+              <w:t>唐骏涛</w:t>
             </w:r>
           </w:p>
         </w:tc>
         <w:tc>
           <w:tcPr>
-            <w:tcW w:w="0" w:type="auto"/>
+            <w:tcW w:w="2100" w:type="dxa"/>
             <w:tcBorders>
               <w:top w:val="single" w:sz="6" w:space="0" w:color="auto"/>
               <w:left w:val="single" w:sz="6" w:space="0" w:color="auto"/>
@@ -732,6 +1211,11 @@
             <w:hideMark/>
           </w:tcPr>
           <w:p>
+            <w:pPr>
+              <w:rPr>
+                <w:rFonts w:hint="eastAsia"/>
+              </w:rPr>
+            </w:pPr>
             <w:r>
               <w:rPr>
                 <w:b/>
@@ -743,7 +1227,7 @@
         </w:tc>
         <w:tc>
           <w:tcPr>
-            <w:tcW w:w="0" w:type="auto"/>
+            <w:tcW w:w="2818" w:type="dxa"/>
             <w:tcBorders>
               <w:top w:val="single" w:sz="6" w:space="0" w:color="auto"/>
               <w:left w:val="single" w:sz="6" w:space="0" w:color="auto"/>
@@ -760,6 +1244,11 @@
             <w:hideMark/>
           </w:tcPr>
           <w:p>
+            <w:pPr>
+              <w:rPr>
+                <w:rFonts w:hint="eastAsia"/>
+              </w:rPr>
+            </w:pPr>
             <w:r>
               <w:rPr>
                 <w:b/>
@@ -768,7 +1257,13 @@
               <w:t>计划执行模式</w:t>
             </w:r>
             <w:r>
-              <w:t>。先拆解复杂统计与可视化任务，再逐步解决。</w:t>
+              <w:t>。先拆解复杂统计与可视化任务，再逐步解决</w:t>
+            </w:r>
+            <w:r>
+              <w:rPr>
+                <w:rFonts w:hint="eastAsia"/>
+              </w:rPr>
+              <w:t>。</w:t>
             </w:r>
           </w:p>
         </w:tc>
@@ -791,6 +1286,11 @@
             <w:hideMark/>
           </w:tcPr>
           <w:p>
+            <w:pPr>
+              <w:rPr>
+                <w:rFonts w:hint="eastAsia"/>
+              </w:rPr>
+            </w:pPr>
             <w:r>
               <w:t>协助复杂数学逻辑拆解与流程控制。</w:t>
             </w:r>
@@ -798,211 +1298,1008 @@
         </w:tc>
       </w:tr>
     </w:tbl>
-    <w:p/>
-    <w:p>
-      <w:pPr>
+    <w:p>
+      <w:pPr>
+        <w:rPr>
+          <w:rFonts w:hint="eastAsia"/>
+        </w:rPr>
+      </w:pPr>
+      <w:r>
+        <w:t>在完成三种 Agent 框架的初步搭建后，开发者也将对 Agent 的基本原理与系统设计方式形成更加深入的理解</w:t>
+      </w:r>
+    </w:p>
+    <w:p>
+      <w:pPr>
+        <w:rPr>
+          <w:rFonts w:hint="eastAsia"/>
+        </w:rPr>
+      </w:pPr>
+      <w:r>
+        <w:rPr>
+          <w:color w:val="47D459" w:themeColor="accent3" w:themeTint="99"/>
+        </w:rPr>
+        <w:t>在此基础上，项目将进入下一阶段的系统化开发</w:t>
+      </w:r>
+    </w:p>
+    <w:p>
+      <w:pPr>
+        <w:rPr>
+          <w:rFonts w:hint="eastAsia"/>
+        </w:rPr>
+      </w:pPr>
+      <w:r>
+        <w:t>首先，我们将重点围绕以下四个核心模块开展同步学习与开发：</w:t>
+      </w:r>
+    </w:p>
+    <w:p>
+      <w:pPr>
+        <w:numPr>
+          <w:ilvl w:val="0"/>
+          <w:numId w:val="6"/>
+        </w:numPr>
+        <w:rPr>
+          <w:rFonts w:hint="eastAsia"/>
+        </w:rPr>
+      </w:pPr>
+      <w:r>
+        <w:t xml:space="preserve">基于 AutoGen + LangGraph 的 Multi-Agent System 架构 </w:t>
+      </w:r>
+    </w:p>
+    <w:p>
+      <w:pPr>
+        <w:numPr>
+          <w:ilvl w:val="0"/>
+          <w:numId w:val="6"/>
+        </w:numPr>
+        <w:rPr>
+          <w:rFonts w:hint="eastAsia"/>
+        </w:rPr>
+      </w:pPr>
+      <w:r>
+        <w:t xml:space="preserve">路由（Router）模块：用于在不同模型与 Agent 之间进行动态任务分配 </w:t>
+      </w:r>
+    </w:p>
+    <w:p>
+      <w:pPr>
+        <w:numPr>
+          <w:ilvl w:val="0"/>
+          <w:numId w:val="6"/>
+        </w:numPr>
+      </w:pPr>
+      <w:r>
+        <w:t xml:space="preserve">RAG + Memory 模块：构建具备长期知识记忆与检索能力的智能体系统 </w:t>
+      </w:r>
+    </w:p>
+    <w:p>
+      <w:pPr>
+        <w:numPr>
+          <w:ilvl w:val="0"/>
+          <w:numId w:val="6"/>
+        </w:numPr>
+        <w:rPr>
+          <w:rFonts w:hint="eastAsia"/>
+        </w:rPr>
+      </w:pPr>
+      <w:r>
+        <w:rPr>
+          <w:rFonts w:hint="eastAsia"/>
+        </w:rPr>
+        <w:t>多branch的context管理，构建具备多状态短期记忆的智能体系统</w:t>
+      </w:r>
+    </w:p>
+    <w:p>
+      <w:pPr>
+        <w:numPr>
+          <w:ilvl w:val="0"/>
+          <w:numId w:val="6"/>
+        </w:numPr>
+        <w:rPr>
+          <w:rFonts w:hint="eastAsia"/>
+        </w:rPr>
+      </w:pPr>
+      <w:r>
+        <w:t xml:space="preserve">Agent Skills 模块：逐步积累可复用的任务技能组件 </w:t>
+      </w:r>
+    </w:p>
+    <w:p>
+      <w:pPr>
+        <w:rPr>
+          <w:rFonts w:hint="eastAsia"/>
+        </w:rPr>
+      </w:pPr>
+      <w:r>
+        <w:t>在这一阶段中，我们将逐步设计并优化 Agent 之间的交互模式，例如任务分解、结果验证与信息共享机制。同时，我们计划构建并训练一个具有较好表现的路由模型，使系统能够根据任务类型、复杂度以及上下文信息自动选择最合适的模型或Agent执行任务。随着系统能力的逐步完善，我们也将持续扩展 Agent 的技能库，从而不断丰富系统的核心功能。</w:t>
+      </w:r>
+    </w:p>
+    <w:p>
+      <w:pPr>
+        <w:rPr>
+          <w:rFonts w:hint="eastAsia"/>
+          <w:color w:val="47D459" w:themeColor="accent3" w:themeTint="99"/>
+        </w:rPr>
+      </w:pPr>
+      <w:r>
+        <w:rPr>
+          <w:color w:val="47D459" w:themeColor="accent3" w:themeTint="99"/>
+        </w:rPr>
+        <w:t>在完成上述模块后，项目将进入系统优化阶段</w:t>
+      </w:r>
+    </w:p>
+    <w:p>
+      <w:pPr>
+        <w:rPr>
+          <w:rFonts w:hint="eastAsia"/>
+        </w:rPr>
+      </w:pPr>
+      <w:r>
+        <w:t>这一阶段的主要目标包括：</w:t>
+      </w:r>
+    </w:p>
+    <w:p>
+      <w:pPr>
+        <w:numPr>
+          <w:ilvl w:val="0"/>
+          <w:numId w:val="7"/>
+        </w:numPr>
+        <w:rPr>
+          <w:rFonts w:hint="eastAsia"/>
+        </w:rPr>
+      </w:pPr>
+      <w:r>
+        <w:t>对 Multi-Agent System 的执行逻辑进行进一步</w:t>
+      </w:r>
+      <w:r>
+        <w:rPr>
+          <w:rFonts w:hint="eastAsia"/>
+        </w:rPr>
+        <w:t>调整</w:t>
+      </w:r>
+      <w:r>
+        <w:t xml:space="preserve">，使任务规划与执行流程更加高效和稳定 </w:t>
+      </w:r>
+    </w:p>
+    <w:p>
+      <w:pPr>
+        <w:numPr>
+          <w:ilvl w:val="0"/>
+          <w:numId w:val="7"/>
+        </w:numPr>
+        <w:rPr>
+          <w:rFonts w:hint="eastAsia"/>
+        </w:rPr>
+      </w:pPr>
+      <w:r>
+        <w:t xml:space="preserve">优化 Agent 之间的协作机制，以减少冗余推理和不必要的调用开销 </w:t>
+      </w:r>
+    </w:p>
+    <w:p>
+      <w:pPr>
+        <w:numPr>
+          <w:ilvl w:val="0"/>
+          <w:numId w:val="7"/>
+        </w:numPr>
+        <w:rPr>
+          <w:rFonts w:hint="eastAsia"/>
+        </w:rPr>
+      </w:pPr>
+      <w:r>
+        <w:t xml:space="preserve">在核心功能基础上开发更多扩展能力，例如复杂文档分析、自动论文润色与结构优化等 </w:t>
+      </w:r>
+    </w:p>
+    <w:p>
+      <w:pPr>
+        <w:numPr>
+          <w:ilvl w:val="0"/>
+          <w:numId w:val="7"/>
+        </w:numPr>
+        <w:rPr>
+          <w:rFonts w:hint="eastAsia"/>
+        </w:rPr>
+      </w:pPr>
+      <w:r>
+        <w:t xml:space="preserve">开始进行 用户界面（UI）设计与开发，使系统从实验性原型逐步过渡到可交互的软件系统 </w:t>
+      </w:r>
+    </w:p>
+    <w:p>
+      <w:pPr>
+        <w:rPr>
+          <w:rFonts w:hint="eastAsia"/>
+        </w:rPr>
+      </w:pPr>
+      <w:r>
+        <w:rPr>
+          <w:color w:val="47D459" w:themeColor="accent3" w:themeTint="99"/>
+        </w:rPr>
+        <w:t>在项目的最后阶段，我们将推动系统从模型原型向实际产品转化</w:t>
+      </w:r>
+    </w:p>
+    <w:p>
+      <w:pPr>
+        <w:rPr>
+          <w:rFonts w:hint="eastAsia"/>
+        </w:rPr>
+      </w:pPr>
+      <w:r>
+        <w:t>目标是构建一个面向学术写作场景的LaTeX插件工具。该工具能够在用户撰写LaTeX文档</w:t>
+      </w:r>
+      <w:r>
+        <w:lastRenderedPageBreak/>
+        <w:t>时实时提供修改建议、结构优化建议以及智能辅助功能，从而显著提升写作效率</w:t>
+      </w:r>
+    </w:p>
+    <w:p>
+      <w:pPr>
+        <w:rPr>
+          <w:rFonts w:hint="eastAsia"/>
+        </w:rPr>
+      </w:pPr>
+      <w:r>
+        <w:t>在这一阶段，我们还将重点关注以下方面：</w:t>
+      </w:r>
+    </w:p>
+    <w:p>
+      <w:pPr>
+        <w:ind w:left="720"/>
+        <w:rPr>
+          <w:rFonts w:hint="eastAsia"/>
+        </w:rPr>
+      </w:pPr>
+      <w:r>
+        <w:t xml:space="preserve">Security：设计合理的权限控制与数据保护机制，确保用户文档与隐私信息的安全 </w:t>
+      </w:r>
+    </w:p>
+    <w:p>
+      <w:pPr>
+        <w:ind w:left="720"/>
+        <w:rPr>
+          <w:rFonts w:hint="eastAsia"/>
+        </w:rPr>
+      </w:pPr>
+      <w:r>
+        <w:t xml:space="preserve">Stability：优化模型调用与任务调度策略，保证系统在复杂任务场景下的稳定运行 </w:t>
+      </w:r>
+    </w:p>
+    <w:p>
+      <w:pPr>
+        <w:ind w:left="720"/>
+        <w:rPr>
+          <w:rFonts w:hint="eastAsia"/>
+        </w:rPr>
+      </w:pPr>
+      <w:r>
+        <w:t xml:space="preserve">Performance：通过缓存机制、任务调度优化等方式降低延迟 </w:t>
+      </w:r>
+    </w:p>
+    <w:p>
+      <w:pPr>
+        <w:ind w:left="720"/>
+        <w:rPr>
+          <w:rFonts w:hint="eastAsia"/>
+        </w:rPr>
+      </w:pPr>
+      <w:r>
+        <w:t xml:space="preserve">User Experience：进一步完善界面交互逻辑，使插件更加易用直观 </w:t>
+      </w:r>
+    </w:p>
+    <w:p>
+      <w:pPr>
+        <w:ind w:firstLine="360"/>
+        <w:rPr>
+          <w:rFonts w:hint="eastAsia"/>
+        </w:rPr>
+      </w:pPr>
+      <w:r>
+        <w:t>最终，我们希望构建一个集 Multi-Agent 协作、智能路由、知识增强与实时写作辅助 于一体的 LaTeX 智能写作系统，为科研人员和学生提供高效、智能的学术写作支持。</w:t>
+      </w:r>
+    </w:p>
+    <w:p>
+      <w:pPr>
+        <w:rPr>
+          <w:rFonts w:hint="eastAsia"/>
+        </w:rPr>
+      </w:pPr>
+      <w:bookmarkStart w:id="0" w:name="OLE_LINK2"/>
+      <w:r>
+        <w:t>三、 项目进度计划表</w:t>
+      </w:r>
+    </w:p>
+    <w:bookmarkEnd w:id="0"/>
+    <w:p>
+      <w:pPr>
+        <w:rPr>
+          <w:rFonts w:hint="eastAsia"/>
+        </w:rPr>
+      </w:pPr>
+      <w:r>
+        <w:t>阶段里程碑</w:t>
+      </w:r>
+    </w:p>
+    <w:p>
+      <w:pPr>
+        <w:rPr>
+          <w:rFonts w:hint="eastAsia"/>
+        </w:rPr>
+      </w:pPr>
+      <w:r>
+        <w:t>本项目整体开发计划划分为四个阶段，分别为 Agent 原型开发阶段、Multi-Agent 系统构建阶段、系统优化与界面开发阶段以及产品化实现阶段。各阶段按照技术复杂度逐步推进，从基础框架开发到系统集成，再到产品化落地，最终完成面向学术写作场景的 LaTeX 智能辅助系统。</w:t>
+      </w:r>
+    </w:p>
+    <w:p>
+      <w:pPr>
+        <w:rPr>
+          <w:rFonts w:hint="eastAsia"/>
+        </w:rPr>
+      </w:pPr>
+      <w:r>
+        <w:pict w14:anchorId="27AB5403">
+          <v:rect id="_x0000_i1028" style="width:0;height:1.5pt" o:hralign="center" o:hrstd="t" o:hr="t" fillcolor="#a0a0a0" stroked="f"/>
+        </w:pict>
+      </w:r>
+    </w:p>
+    <w:p>
+      <w:pPr>
+        <w:rPr>
+          <w:rFonts w:hint="eastAsia"/>
+        </w:rPr>
+      </w:pPr>
+      <w:r>
+        <w:t>第一阶段：Agent 原型开发阶段</w:t>
+      </w:r>
+    </w:p>
+    <w:p>
+      <w:pPr>
+        <w:rPr>
+          <w:rFonts w:hint="eastAsia"/>
+        </w:rPr>
+      </w:pPr>
+      <w:r>
+        <w:t>本阶段主要采用“一人一框架”的并行开发模式，由团队成员分别实现不同类型的 Agent 架构，通过对多种 Agent 工作模式的实践探索，为后续 Multi-Agent 系统的设计提供技术基础。</w:t>
+      </w:r>
+    </w:p>
+    <w:p>
+      <w:pPr>
+        <w:rPr>
+          <w:rFonts w:hint="eastAsia"/>
+        </w:rPr>
+      </w:pPr>
+      <w:r>
+        <w:t>主要任务包括：</w:t>
+      </w:r>
+    </w:p>
+    <w:p>
+      <w:pPr>
+        <w:rPr>
+          <w:rFonts w:hint="eastAsia"/>
+        </w:rPr>
+      </w:pPr>
+      <w:r>
+        <w:t>（1）实现四种基础Agent架构：SimpleAgent、ReActAgent、ReflectionAgent 和 PlanAndSolveAgent。</w:t>
+      </w:r>
+    </w:p>
+    <w:p>
+      <w:pPr>
+        <w:rPr>
+          <w:rFonts w:hint="eastAsia"/>
+        </w:rPr>
+      </w:pPr>
+      <w:r>
+        <w:t>（2）开发基本工具调用能力，例如 LaTeX 文本处理、信息检索以及数据分析等功能。</w:t>
+      </w:r>
+    </w:p>
+    <w:p>
+      <w:pPr>
+        <w:rPr>
+          <w:rFonts w:hint="eastAsia"/>
+        </w:rPr>
+      </w:pPr>
+      <w:r>
+        <w:t>（3）搭建基础 API 调用框架与 Prompt 模板。</w:t>
+      </w:r>
+    </w:p>
+    <w:p>
+      <w:pPr>
+        <w:rPr>
+          <w:rFonts w:hint="eastAsia"/>
+        </w:rPr>
+      </w:pPr>
+      <w:r>
+        <w:t>（4）借助 AI Copilot 工具辅助完成 API 封装、Prompt 设计、推理链调试以及样本生成等开发任务。</w:t>
+      </w:r>
+    </w:p>
+    <w:p>
+      <w:pPr>
+        <w:rPr>
+          <w:rFonts w:hint="eastAsia"/>
+        </w:rPr>
+      </w:pPr>
+      <w:r>
+        <w:t>阶段成果为完成多个 Agent 原型系统，并形成不同 Agent 架构的对比分析，为 Multi-Agent 系统设计提供技术基础。</w:t>
+      </w:r>
+    </w:p>
+    <w:p>
+      <w:pPr>
+        <w:rPr>
+          <w:rFonts w:hint="eastAsia"/>
+        </w:rPr>
+      </w:pPr>
+      <w:r>
+        <w:pict w14:anchorId="72C2C7C9">
+          <v:rect id="_x0000_i1029" style="width:0;height:1.5pt" o:hralign="center" o:hrstd="t" o:hr="t" fillcolor="#a0a0a0" stroked="f"/>
+        </w:pict>
+      </w:r>
+    </w:p>
+    <w:p>
+      <w:pPr>
+        <w:rPr>
+          <w:rFonts w:hint="eastAsia"/>
+        </w:rPr>
+      </w:pPr>
+      <w:r>
+        <w:t>第二阶段：Multi-Agent 系统构建阶段</w:t>
+      </w:r>
+    </w:p>
+    <w:p>
+      <w:pPr>
+        <w:rPr>
+          <w:rFonts w:hint="eastAsia"/>
+        </w:rPr>
+      </w:pPr>
+      <w:r>
+        <w:t>在完成基础 Agent 原型开发后，项目将进入 Multi-Agent 系统构建阶段。本阶段的目标是将单个 Agent 的能力整合为统一的多智能体系统，并构建系统的核心功能模块。</w:t>
+      </w:r>
+    </w:p>
+    <w:p>
+      <w:pPr>
+        <w:rPr>
+          <w:rFonts w:hint="eastAsia"/>
+        </w:rPr>
+      </w:pPr>
+      <w:r>
+        <w:t>主要任务包括：</w:t>
+      </w:r>
+    </w:p>
+    <w:p>
+      <w:pPr>
+        <w:rPr>
+          <w:rFonts w:hint="eastAsia"/>
+        </w:rPr>
+      </w:pPr>
+      <w:r>
+        <w:t>（1）基于 AutoGen 与 LangGraph 构建 Multi-Agent System 架构，实现多个 Agent 之间的协同工作。</w:t>
+      </w:r>
+    </w:p>
+    <w:p>
+      <w:pPr>
+        <w:rPr>
+          <w:rFonts w:hint="eastAsia"/>
+        </w:rPr>
+      </w:pPr>
+      <w:r>
+        <w:t>（2）开发 Router 模块，使系统能够根据任务类型、复杂度以及上下文信息动态选择最合适的模型或 Agent 执行任务。</w:t>
+      </w:r>
+    </w:p>
+    <w:p>
+      <w:r>
+        <w:t>（3）构建 RAG + Memory 模块，实现文档检索、</w:t>
+      </w:r>
+      <w:r>
+        <w:rPr>
+          <w:rFonts w:hint="eastAsia"/>
+        </w:rPr>
+        <w:t>长期</w:t>
+      </w:r>
+      <w:r>
+        <w:t>知识记忆</w:t>
+      </w:r>
+    </w:p>
+    <w:p>
+      <w:pPr>
+        <w:rPr>
+          <w:rFonts w:hint="eastAsia"/>
+        </w:rPr>
+      </w:pPr>
+      <w:r>
+        <w:t>（</w:t>
+      </w:r>
+      <w:r>
+        <w:rPr>
+          <w:rFonts w:hint="eastAsia"/>
+        </w:rPr>
+        <w:t>4</w:t>
+      </w:r>
+      <w:r>
+        <w:t>）</w:t>
+      </w:r>
+      <w:r>
+        <w:rPr>
+          <w:rFonts w:hint="eastAsia"/>
+        </w:rPr>
+        <w:t>实现类似git branch的</w:t>
+      </w:r>
+      <w:r>
+        <w:t>上下文信息管理功能。</w:t>
+      </w:r>
+      <w:r>
+        <w:rPr>
+          <w:rFonts w:hint="eastAsia"/>
+        </w:rPr>
+        <w:t>允许agent的短期记忆在多个状态之间</w:t>
+      </w:r>
+      <w:r>
+        <w:rPr>
+          <w:rFonts w:hint="eastAsia"/>
+        </w:rPr>
+        <w:t>转换</w:t>
+      </w:r>
+      <w:r>
+        <w:rPr>
+          <w:rFonts w:hint="eastAsia"/>
+        </w:rPr>
+        <w:t>。</w:t>
+      </w:r>
+    </w:p>
+    <w:p>
+      <w:pPr>
+        <w:rPr>
+          <w:rFonts w:hint="eastAsia"/>
+        </w:rPr>
+      </w:pPr>
+      <w:r>
+        <w:t>（4）开发 Agent Skills 模块，逐步积累可复用的任务技能组件。</w:t>
+      </w:r>
+    </w:p>
+    <w:p>
+      <w:pPr>
+        <w:rPr>
+          <w:rFonts w:hint="eastAsia"/>
+        </w:rPr>
+      </w:pPr>
+      <w:r>
+        <w:t>（5）设计 Agent 之间的交互机制，包括任务拆解、信息共享以及结果验证流程。</w:t>
+      </w:r>
+    </w:p>
+    <w:p>
+      <w:pPr>
+        <w:rPr>
+          <w:rFonts w:hint="eastAsia"/>
+        </w:rPr>
+      </w:pPr>
+      <w:r>
+        <w:t>完成本阶段后，系统将具备基本的 Multi-Agent 协作能力，并能够完成较为复杂的 LaTeX 文档分析与辅助任务。</w:t>
+      </w:r>
+    </w:p>
+    <w:p>
+      <w:pPr>
+        <w:rPr>
+          <w:rFonts w:hint="eastAsia"/>
+        </w:rPr>
+      </w:pPr>
+      <w:r>
+        <w:pict w14:anchorId="35775BE9">
+          <v:rect id="_x0000_i1030" style="width:0;height:1.5pt" o:hralign="center" o:hrstd="t" o:hr="t" fillcolor="#a0a0a0" stroked="f"/>
+        </w:pict>
+      </w:r>
+    </w:p>
+    <w:p>
+      <w:pPr>
+        <w:rPr>
+          <w:rFonts w:hint="eastAsia"/>
+        </w:rPr>
+      </w:pPr>
+      <w:r>
+        <w:lastRenderedPageBreak/>
+        <w:t>第三阶段：系统优化与界面开发阶段</w:t>
+      </w:r>
+    </w:p>
+    <w:p>
+      <w:pPr>
+        <w:rPr>
+          <w:rFonts w:hint="eastAsia"/>
+        </w:rPr>
+      </w:pPr>
+      <w:r>
+        <w:t>在 Multi-Agent 系统基础架构完成之后，项目将进入系统优化与界面开发阶段。本阶段的主要目标是对系统执行逻辑进行优化，并逐步开发用户交互界面。</w:t>
+      </w:r>
+    </w:p>
+    <w:p>
+      <w:pPr>
+        <w:rPr>
+          <w:rFonts w:hint="eastAsia"/>
+        </w:rPr>
+      </w:pPr>
+      <w:r>
+        <w:t>主要任务包括：</w:t>
+      </w:r>
+    </w:p>
+    <w:p>
+      <w:pPr>
+        <w:rPr>
+          <w:rFonts w:hint="eastAsia"/>
+        </w:rPr>
+      </w:pPr>
+      <w:r>
+        <w:t>（1）优化 Multi-Agent 的任务执行流程，提高任务规划效率并减少冗余推理。</w:t>
+      </w:r>
+    </w:p>
+    <w:p>
+      <w:pPr>
+        <w:rPr>
+          <w:rFonts w:hint="eastAsia"/>
+        </w:rPr>
+      </w:pPr>
+      <w:r>
+        <w:t>（2）改进 Agent 之间的协作机制，提高多 Agent 协同工作效率。</w:t>
+      </w:r>
+    </w:p>
+    <w:p>
+      <w:pPr>
+        <w:rPr>
+          <w:rFonts w:hint="eastAsia"/>
+        </w:rPr>
+      </w:pPr>
+      <w:r>
+        <w:t>（3）扩展系统功能，例如复杂文档分析、自动论文润色以及结构优化建议等功能。</w:t>
+      </w:r>
+    </w:p>
+    <w:p>
+      <w:pPr>
+        <w:rPr>
+          <w:rFonts w:hint="eastAsia"/>
+        </w:rPr>
+      </w:pPr>
+      <w:r>
+        <w:t>（4）设计并开发用户界面（UI），使系统具备基本的交互能力。</w:t>
+      </w:r>
+    </w:p>
+    <w:p>
+      <w:pPr>
+        <w:rPr>
+          <w:rFonts w:hint="eastAsia"/>
+        </w:rPr>
+      </w:pPr>
+      <w:r>
+        <w:t>完成本阶段后，系统将形成一个具备稳定运行能力和基本交互界面的智能写作辅助系统。</w:t>
+      </w:r>
+    </w:p>
+    <w:p>
+      <w:pPr>
+        <w:rPr>
+          <w:rFonts w:hint="eastAsia"/>
+        </w:rPr>
+      </w:pPr>
+      <w:r>
+        <w:pict w14:anchorId="3F0DD715">
+          <v:rect id="_x0000_i1031" style="width:0;height:1.5pt" o:hralign="center" o:hrstd="t" o:hr="t" fillcolor="#a0a0a0" stroked="f"/>
+        </w:pict>
+      </w:r>
+    </w:p>
+    <w:p>
+      <w:pPr>
+        <w:rPr>
+          <w:rFonts w:hint="eastAsia"/>
+        </w:rPr>
+      </w:pPr>
+      <w:r>
+        <w:t>第四阶段：产品化与插件实现阶段</w:t>
+      </w:r>
+    </w:p>
+    <w:p>
+      <w:pPr>
+        <w:rPr>
+          <w:rFonts w:hint="eastAsia"/>
+        </w:rPr>
+      </w:pPr>
+      <w:r>
+        <w:t>在完成系统优化之后，项目将进入产品化阶段。本阶段的目标是将系统从实验性原型转化为实际应用产品，并实现面向学术写作场景的 LaTeX 插件工具。</w:t>
+      </w:r>
+    </w:p>
+    <w:p>
+      <w:pPr>
+        <w:rPr>
+          <w:rFonts w:hint="eastAsia"/>
+        </w:rPr>
+      </w:pPr>
+      <w:r>
+        <w:t>主要任务包括：</w:t>
+      </w:r>
+    </w:p>
+    <w:p>
+      <w:pPr>
+        <w:rPr>
+          <w:rFonts w:hint="eastAsia"/>
+        </w:rPr>
+      </w:pPr>
+      <w:r>
+        <w:t>（1）将 Multi-Agent 系统功能集成到 LaTeX 编辑环境中，实现实时写作辅助功能。</w:t>
+      </w:r>
+    </w:p>
+    <w:p>
+      <w:pPr>
+        <w:rPr>
+          <w:rFonts w:hint="eastAsia"/>
+        </w:rPr>
+      </w:pPr>
+      <w:r>
+        <w:t>（2）完善系统界面设计和用户交互体验。</w:t>
+      </w:r>
+    </w:p>
+    <w:p>
+      <w:pPr>
+        <w:rPr>
+          <w:rFonts w:hint="eastAsia"/>
+        </w:rPr>
+      </w:pPr>
+      <w:r>
+        <w:t>（3）设计系统安全机制（Security），通过权限控制和数据保护措施保障用户文档与隐私安全。</w:t>
+      </w:r>
+    </w:p>
+    <w:p>
+      <w:pPr>
+        <w:rPr>
+          <w:rFonts w:hint="eastAsia"/>
+        </w:rPr>
+      </w:pPr>
+      <w:r>
+        <w:t>（4）优化系统稳定性（Stability）和性能（Performance），通过缓存机制和任务调度优化降低响应延迟。</w:t>
+      </w:r>
+    </w:p>
+    <w:p>
+      <w:pPr>
+        <w:rPr>
+          <w:rFonts w:hint="eastAsia"/>
+        </w:rPr>
+      </w:pPr>
+      <w:r>
+        <w:t>（5）持续改进用户体验（User Experience），使插件更加易用和高效。</w:t>
+      </w:r>
+    </w:p>
+    <w:p>
+      <w:pPr>
+        <w:rPr>
+          <w:rFonts w:hint="eastAsia"/>
+        </w:rPr>
+      </w:pPr>
+      <w:r>
+        <w:t>最终，本项目将实现一个集 Multi-Agent 协作、智能路由、知识增强以及实时写作辅助 于一体的 LaTeX 智能写作系统，为科研人员与学生提供高效、智能的学术写作支持。</w:t>
+      </w:r>
+    </w:p>
+    <w:p>
+      <w:pPr>
+        <w:rPr>
+          <w:rFonts w:hint="eastAsia"/>
+        </w:rPr>
+      </w:pPr>
+      <w:r>
+        <w:pict w14:anchorId="3DB23AE9">
+          <v:rect id="_x0000_i1032" style="width:0;height:1.5pt" o:hralign="center" o:hrstd="t" o:hrnoshade="t" o:hr="t" fillcolor="gray" stroked="f"/>
+        </w:pict>
+      </w:r>
+    </w:p>
+    <w:p>
+      <w:pPr>
+        <w:rPr>
+          <w:rFonts w:hint="eastAsia"/>
+        </w:rPr>
+      </w:pPr>
+      <w:r>
+        <w:t>四、中期预期完成进度</w:t>
+      </w:r>
+    </w:p>
+    <w:p>
+      <w:pPr>
+        <w:rPr>
+          <w:rFonts w:hint="eastAsia"/>
+        </w:rPr>
+      </w:pPr>
+      <w:r>
+        <w:t>截至项目中期的核心目标是：</w:t>
+      </w:r>
+      <w:r>
         <w:rPr>
           <w:b/>
           <w:bCs/>
         </w:rPr>
-      </w:pPr>
-      <w:r>
-        <w:rPr>
-          <w:b/>
-          <w:bCs/>
-        </w:rPr>
-        <w:t>三、 项目进度计划表</w:t>
-      </w:r>
-    </w:p>
-    <w:p>
-      <w:pPr>
-        <w:rPr>
-          <w:b/>
-          <w:bCs/>
-        </w:rPr>
-      </w:pPr>
-      <w:r>
-        <w:rPr>
-          <w:b/>
-          <w:bCs/>
-        </w:rPr>
-        <w:t>3.1 阶段里程碑</w:t>
-      </w:r>
-    </w:p>
-    <w:p>
-      <w:pPr>
-        <w:numPr>
-          <w:ilvl w:val="0"/>
-          <w:numId w:val="2"/>
-        </w:numPr>
-      </w:pPr>
-      <w:r>
-        <w:rPr>
-          <w:b/>
-          <w:bCs/>
-        </w:rPr>
-        <w:t>准备阶段</w:t>
-      </w:r>
-      <w:r>
-        <w:t>：技术选型，完成各 Agent 框架的基础 Demo 环境搭建。</w:t>
-      </w:r>
-    </w:p>
-    <w:p>
-      <w:pPr>
-        <w:numPr>
-          <w:ilvl w:val="0"/>
-          <w:numId w:val="2"/>
-        </w:numPr>
-      </w:pPr>
-      <w:r>
-        <w:rPr>
-          <w:b/>
-          <w:bCs/>
-        </w:rPr>
-        <w:t>模块开发</w:t>
-      </w:r>
-      <w:r>
-        <w:t>：各成员独立开发所负责的 Agent 核心逻辑，完成工具集（Tools）对接。</w:t>
-      </w:r>
-    </w:p>
-    <w:p>
-      <w:pPr>
-        <w:numPr>
-          <w:ilvl w:val="0"/>
-          <w:numId w:val="2"/>
-        </w:numPr>
-      </w:pPr>
-      <w:r>
-        <w:rPr>
-          <w:b/>
-          <w:bCs/>
-        </w:rPr>
-        <w:t>中期集成</w:t>
-      </w:r>
-      <w:r>
-        <w:t>：进行初步的接口联调，确保各 Agent 能够协同工作。</w:t>
-      </w:r>
-    </w:p>
-    <w:p>
-      <w:pPr>
-        <w:numPr>
-          <w:ilvl w:val="0"/>
-          <w:numId w:val="2"/>
-        </w:numPr>
-      </w:pPr>
-      <w:r>
-        <w:rPr>
-          <w:b/>
-          <w:bCs/>
-        </w:rPr>
-        <w:t>中期评估</w:t>
-      </w:r>
-      <w:r>
-        <w:t>：正式提交中期进度报告，演示原型功能。</w:t>
-      </w:r>
-    </w:p>
-    <w:p>
-      <w:r>
-        <w:pict w14:anchorId="3DB23AE9">
-          <v:rect id="_x0000_i1071" style="width:0;height:1.5pt" o:hralign="center" o:hrstd="t" o:hrnoshade="t" o:hr="t" fillcolor="gray" stroked="f"/>
-        </w:pict>
-      </w:r>
-    </w:p>
-    <w:p>
-      <w:r>
-        <w:rPr>
-          <w:b/>
-          <w:bCs/>
-        </w:rPr>
-        <w:t>四、 中期预期完成进度</w:t>
-      </w:r>
-    </w:p>
-    <w:p>
-      <w:pPr>
-        <w:rPr>
-          <w:rFonts w:hint="eastAsia"/>
-          <w:b/>
-          <w:bCs/>
-        </w:rPr>
-      </w:pPr>
-      <w:r>
-        <w:rPr>
-          <w:b/>
-          <w:bCs/>
-        </w:rPr>
-        <w:lastRenderedPageBreak/>
-        <w:t>4.1 架构层面</w:t>
-      </w:r>
-    </w:p>
-    <w:p>
-      <w:pPr>
-        <w:numPr>
-          <w:ilvl w:val="0"/>
-          <w:numId w:val="3"/>
-        </w:numPr>
-      </w:pPr>
-      <w:r>
-        <w:rPr>
-          <w:b/>
-          <w:bCs/>
-        </w:rPr>
-        <w:t>Agent 骨架搭建完毕</w:t>
-      </w:r>
-      <w:r>
-        <w:t>：四个框架（Simple, ReAct, Reflection, PlanAndSolve）的基类定义完成，支持通过 LLM 进行基本的指令响应。</w:t>
-      </w:r>
-    </w:p>
-    <w:p>
-      <w:pPr>
-        <w:numPr>
-          <w:ilvl w:val="0"/>
-          <w:numId w:val="3"/>
-        </w:numPr>
-      </w:pPr>
-      <w:r>
-        <w:rPr>
-          <w:b/>
-          <w:bCs/>
-        </w:rPr>
-        <w:t>工具调用通路跑通</w:t>
-      </w:r>
-      <w:r>
-        <w:t>：Agent 能够成功调用外部函数。</w:t>
-      </w:r>
-    </w:p>
-    <w:p>
-      <w:pPr>
-        <w:rPr>
-          <w:b/>
-          <w:bCs/>
-        </w:rPr>
-      </w:pPr>
-      <w:r>
-        <w:rPr>
-          <w:b/>
-          <w:bCs/>
-        </w:rPr>
-        <w:t>4.2 功能层面</w:t>
-      </w:r>
-    </w:p>
-    <w:p>
-      <w:pPr>
-        <w:numPr>
-          <w:ilvl w:val="0"/>
-          <w:numId w:val="4"/>
-        </w:numPr>
-        <w:rPr>
-          <w:rFonts w:hint="eastAsia"/>
-        </w:rPr>
-      </w:pPr>
-      <w:r>
-        <w:rPr>
-          <w:rFonts w:hint="eastAsia"/>
-          <w:b/>
-          <w:bCs/>
-        </w:rPr>
-        <w:t>完成需求定义中的部分功能，具有初步的实际意义。</w:t>
-      </w:r>
+        <w:t>打通系统全链路，产出一个可运行的MVP原型</w:t>
+      </w:r>
+      <w:r>
+        <w:t>，验证多Agent 协同与核心功能的技术可行性。具体预期指标与展现形态如下</w:t>
+      </w:r>
+      <w:r>
+        <w:rPr>
+          <w:rFonts w:hint="eastAsia"/>
+        </w:rPr>
+        <w:t>：</w:t>
+      </w:r>
+    </w:p>
+    <w:p>
+      <w:pPr>
+        <w:rPr>
+          <w:rFonts w:hint="eastAsia"/>
+        </w:rPr>
+      </w:pPr>
+      <w:r>
+        <w:rPr>
+          <w:rFonts w:hint="eastAsia"/>
+        </w:rPr>
+        <w:t>4.1 基础框架搭建成功</w:t>
+      </w:r>
+    </w:p>
+    <w:p>
+      <w:pPr>
+        <w:ind w:firstLine="420"/>
+      </w:pPr>
+      <w:r>
+        <w:rPr>
+          <w:rFonts w:hint="eastAsia"/>
+        </w:rPr>
+        <w:t>四种基础Agent架构搭建并独立调试完毕，基于</w:t>
+      </w:r>
+      <w:r>
+        <w:t>AutoGen</w:t>
+      </w:r>
+      <w:r>
+        <w:rPr>
+          <w:rFonts w:hint="eastAsia"/>
+        </w:rPr>
+        <w:t>和</w:t>
+      </w:r>
+      <w:r>
+        <w:t>LangGraph</w:t>
+      </w:r>
+      <w:r>
+        <w:rPr>
+          <w:rFonts w:hint="eastAsia"/>
+        </w:rPr>
+        <w:t>混合逻辑</w:t>
+      </w:r>
+      <w:r>
+        <w:t>的主控框架搭建初步完成</w:t>
+      </w:r>
+      <w:r>
+        <w:rPr>
+          <w:rFonts w:hint="eastAsia"/>
+        </w:rPr>
+        <w:t>，</w:t>
+      </w:r>
+      <w:r>
+        <w:t>Agent之间能够实现基础的消息传递与状态流转</w:t>
+      </w:r>
+      <w:r>
+        <w:rPr>
+          <w:rFonts w:hint="eastAsia"/>
+        </w:rPr>
+        <w:t>。</w:t>
+      </w:r>
+    </w:p>
+    <w:p>
+      <w:pPr>
+        <w:ind w:firstLine="420"/>
+        <w:rPr>
+          <w:rFonts w:hint="eastAsia"/>
+        </w:rPr>
+      </w:pPr>
+      <w:r>
+        <w:rPr>
+          <w:rFonts w:hint="eastAsia"/>
+        </w:rPr>
+        <w:t>有类似git的branch上下文管理，允许agent记忆在多个状态之间迁移，符合人类思维跳跃和转变的现实情境。</w:t>
+      </w:r>
+    </w:p>
+    <w:p>
+      <w:pPr>
+        <w:ind w:firstLine="420"/>
+        <w:rPr>
+          <w:rFonts w:hint="eastAsia"/>
+        </w:rPr>
+      </w:pPr>
+      <w:r>
+        <w:rPr>
+          <w:rFonts w:hint="eastAsia"/>
+        </w:rPr>
+        <w:t>RAG模块完成基本的本地向量库搭建，支持单篇或小批量的学术文档解析与检索学习</w:t>
+      </w:r>
+      <w:r>
+        <w:rPr>
+          <w:rFonts w:hint="eastAsia"/>
+        </w:rPr>
+        <w:t>。</w:t>
+      </w:r>
+    </w:p>
+    <w:p>
+      <w:pPr>
+        <w:rPr>
+          <w:rFonts w:hint="eastAsia"/>
+        </w:rPr>
+      </w:pPr>
+      <w:r>
+        <w:rPr>
+          <w:rFonts w:hint="eastAsia"/>
+        </w:rPr>
+        <w:t>4.2 路由分发与多Agent基本协同</w:t>
+      </w:r>
+    </w:p>
+    <w:p>
+      <w:pPr>
+        <w:ind w:firstLine="420"/>
+        <w:rPr>
+          <w:rFonts w:hint="eastAsia"/>
+        </w:rPr>
+      </w:pPr>
+      <w:r>
+        <w:t>R</w:t>
+      </w:r>
+      <w:r>
+        <w:rPr>
+          <w:rFonts w:hint="eastAsia"/>
+        </w:rPr>
+        <w:t>outer模块实现最基础的模式搭建，比如能够根据用户显示提示进行路由；4</w:t>
+      </w:r>
+      <w:r>
+        <w:rPr>
+          <w:rFonts w:ascii="Segoe UI Emoji" w:hAnsi="Segoe UI Emoji" w:cs="Segoe UI Emoji" w:hint="eastAsia"/>
+        </w:rPr>
+        <w:t>种</w:t>
+      </w:r>
+      <w:r>
+        <w:rPr>
+          <w:rFonts w:hint="eastAsia"/>
+        </w:rPr>
+        <w:t>Agent基本架构以及多Agent架构可以协同在一起完成任务</w:t>
+      </w:r>
+      <w:r>
+        <w:rPr>
+          <w:rFonts w:hint="eastAsia"/>
+        </w:rPr>
+        <w:t>。</w:t>
+      </w:r>
+    </w:p>
+    <w:p>
+      <w:pPr>
+        <w:rPr>
+          <w:rFonts w:hint="eastAsia"/>
+        </w:rPr>
+      </w:pPr>
+      <w:r>
+        <w:rPr>
+          <w:rFonts w:hint="eastAsia"/>
+        </w:rPr>
+        <w:t>4.3 交互界面与功能实现</w:t>
+      </w:r>
+    </w:p>
+    <w:p>
+      <w:pPr>
+        <w:ind w:firstLine="420"/>
+        <w:rPr>
+          <w:rFonts w:hint="eastAsia"/>
+        </w:rPr>
+      </w:pPr>
+      <w:r>
+        <w:rPr>
+          <w:rFonts w:hint="eastAsia"/>
+        </w:rPr>
+        <w:t>中期暂时不追求插件级完整UI，将实现基于命令行（或轻量级web）的基本交互界面。</w:t>
+      </w:r>
+    </w:p>
+    <w:p>
+      <w:pPr>
+        <w:ind w:firstLine="420"/>
+        <w:rPr>
+          <w:rFonts w:hint="eastAsia"/>
+        </w:rPr>
+      </w:pPr>
+      <w:r>
+        <w:rPr>
+          <w:rFonts w:hint="eastAsia"/>
+        </w:rPr>
+        <w:t>智能体能够根据用户的指定的文件路径，进行最基本的latex论文辅助协作功能，能够根据用户的要求自主学习或检索相关文献，并提出润色建议。</w:t>
+      </w:r>
+    </w:p>
+    <w:p>
+      <w:pPr>
+        <w:rPr>
+          <w:rFonts w:hint="eastAsia"/>
+        </w:rPr>
+      </w:pPr>
     </w:p>
     <w:sectPr>
       <w:pgSz w:w="11906" w:h="16838"/>
@@ -1015,7 +2312,7 @@
 </file>
 
 <file path=word/numbering.xml><?xml version="1.0" encoding="utf-8"?>
-<w:numbering xmlns:wpc="http://schemas.microsoft.com/office/word/2010/wordprocessingCanvas" xmlns:cx="http://schemas.microsoft.com/office/drawing/2014/chartex" xmlns:cx1="http://schemas.microsoft.com/office/drawing/2015/9/8/chartex" xmlns:cx2="http://schemas.microsoft.com/office/drawing/2015/10/21/chartex" xmlns:cx3="http://schemas.microsoft.com/office/drawing/2016/5/9/chartex" xmlns:cx4="http://schemas.microsoft.com/office/drawing/2016/5/10/chartex" xmlns:cx5="http://schemas.microsoft.com/office/drawing/2016/5/11/chartex" xmlns:cx6="http://schemas.microsoft.com/office/drawing/2016/5/12/chartex" xmlns:cx7="http://schemas.microsoft.com/office/drawing/2016/5/13/chartex" xmlns:cx8="http://schemas.microsoft.com/office/drawing/2016/5/14/chartex" xmlns:mc="http://schemas.openxmlformats.org/markup-compatibility/2006" xmlns:aink="http://schemas.microsoft.com/office/drawing/2016/ink" xmlns:am3d="http://schemas.microsoft.com/office/drawing/2017/model3d" xmlns:o="urn:schemas-microsoft-com:office:office" xmlns:oel="http://schemas.microsoft.com/office/2019/extlst" xmlns:r="http://schemas.openxmlformats.org/officeDocument/2006/relationships" xmlns:m="http://schemas.openxmlformats.org/officeDocument/2006/math" xmlns:v="urn:schemas-microsoft-com:vml" xmlns:wp14="http://schemas.microsoft.com/office/word/2010/wordprocessingDrawing" xmlns:wp="http://schemas.openxmlformats.org/drawingml/2006/wordprocessingDrawing" xmlns:w10="urn:schemas-microsoft-com:office:word" xmlns:w="http://schemas.openxmlformats.org/wordprocessingml/2006/main" xmlns:w14="http://schemas.microsoft.com/office/word/2010/wordml" xmlns:w15="http://schemas.microsoft.com/office/word/2012/wordml" xmlns:w16cex="http://schemas.microsoft.com/office/word/2018/wordml/cex" xmlns:w16cid="http://schemas.microsoft.com/office/word/2016/wordml/cid" xmlns:w16="http://schemas.microsoft.com/office/word/2018/wordml" xmlns:w16du="http://schemas.microsoft.com/office/word/2023/wordml/word16du" xmlns:w16sdtdh="http://schemas.microsoft.com/office/word/2020/wordml/sdtdatahash" xmlns:w16sdtfl="http://schemas.microsoft.com/office/word/2024/wordml/sdtformatlock" xmlns:w16se="http://schemas.microsoft.com/office/word/2015/wordml/symex" xmlns:wpg="http://schemas.microsoft.com/office/word/2010/wordprocessingGroup" xmlns:wpi="http://schemas.microsoft.com/office/word/2010/wordprocessingInk" xmlns:wne="http://schemas.microsoft.com/office/word/2006/wordml" xmlns:wps="http://schemas.microsoft.com/office/word/2010/wordprocessingShape" mc:Ignorable="w14 w15 w16se w16cid w16 w16cex w16sdtdh w16sdtfl w16du wp14">
+<w:numbering xmlns:wpc="http://schemas.microsoft.com/office/word/2010/wordprocessingCanvas" xmlns:cx="http://schemas.microsoft.com/office/drawing/2014/chartex" xmlns:cx1="http://schemas.microsoft.com/office/drawing/2015/9/8/chartex" xmlns:cx2="http://schemas.microsoft.com/office/drawing/2015/10/21/chartex" xmlns:cx3="http://schemas.microsoft.com/office/drawing/2016/5/9/chartex" xmlns:cx4="http://schemas.microsoft.com/office/drawing/2016/5/10/chartex" xmlns:cx5="http://schemas.microsoft.com/office/drawing/2016/5/11/chartex" xmlns:cx6="http://schemas.microsoft.com/office/drawing/2016/5/12/chartex" xmlns:cx7="http://schemas.microsoft.com/office/drawing/2016/5/13/chartex" xmlns:cx8="http://schemas.microsoft.com/office/drawing/2016/5/14/chartex" xmlns:mc="http://schemas.openxmlformats.org/markup-compatibility/2006" xmlns:aink="http://schemas.microsoft.com/office/drawing/2016/ink" xmlns:am3d="http://schemas.microsoft.com/office/drawing/2017/model3d" xmlns:o="urn:schemas-microsoft-com:office:office" xmlns:oel="http://schemas.microsoft.com/office/2019/extlst" xmlns:r="http://schemas.openxmlformats.org/officeDocument/2006/relationships" xmlns:m="http://schemas.openxmlformats.org/officeDocument/2006/math" xmlns:v="urn:schemas-microsoft-com:vml" xmlns:wp14="http://schemas.microsoft.com/office/word/2010/wordprocessingDrawing" xmlns:wp="http://schemas.openxmlformats.org/drawingml/2006/wordprocessingDrawing" xmlns:w10="urn:schemas-microsoft-com:office:word" xmlns:w="http://schemas.openxmlformats.org/wordprocessingml/2006/main" xmlns:w14="http://schemas.microsoft.com/office/word/2010/wordml" xmlns:w15="http://schemas.microsoft.com/office/word/2012/wordml" xmlns:w16cex="http://schemas.microsoft.com/office/word/2018/wordml/cex" xmlns:w16cid="http://schemas.microsoft.com/office/word/2016/wordml/cid" xmlns:w16="http://schemas.microsoft.com/office/word/2018/wordml" xmlns:w16sdtdh="http://schemas.microsoft.com/office/word/2020/wordml/sdtdatahash" xmlns:w16se="http://schemas.microsoft.com/office/word/2015/wordml/symex" xmlns:wpg="http://schemas.microsoft.com/office/word/2010/wordprocessingGroup" xmlns:wpi="http://schemas.microsoft.com/office/word/2010/wordprocessingInk" xmlns:wne="http://schemas.microsoft.com/office/word/2006/wordml" xmlns:wps="http://schemas.microsoft.com/office/word/2010/wordprocessingShape" mc:Ignorable="w14 w15 w16se w16cid w16 w16cex w16sdtdh wp14">
   <w:abstractNum w:abstractNumId="0" w15:restartNumberingAfterBreak="0">
     <w:nsid w:val="0C3C0C1D"/>
     <w:multiLevelType w:val="multilevel"/>
@@ -1166,6 +2463,155 @@
     </w:lvl>
   </w:abstractNum>
   <w:abstractNum w:abstractNumId="1" w15:restartNumberingAfterBreak="0">
+    <w:nsid w:val="15E4732F"/>
+    <w:multiLevelType w:val="multilevel"/>
+    <w:tmpl w:val="4100F306"/>
+    <w:lvl w:ilvl="0">
+      <w:start w:val="1"/>
+      <w:numFmt w:val="bullet"/>
+      <w:lvlText w:val=""/>
+      <w:lvlJc w:val="left"/>
+      <w:pPr>
+        <w:tabs>
+          <w:tab w:val="num" w:pos="720"/>
+        </w:tabs>
+        <w:ind w:left="720" w:hanging="360"/>
+      </w:pPr>
+      <w:rPr>
+        <w:rFonts w:ascii="Symbol" w:hAnsi="Symbol" w:hint="default"/>
+        <w:sz w:val="20"/>
+      </w:rPr>
+    </w:lvl>
+    <w:lvl w:ilvl="1" w:tentative="1">
+      <w:start w:val="1"/>
+      <w:numFmt w:val="bullet"/>
+      <w:lvlText w:val="o"/>
+      <w:lvlJc w:val="left"/>
+      <w:pPr>
+        <w:tabs>
+          <w:tab w:val="num" w:pos="1440"/>
+        </w:tabs>
+        <w:ind w:left="1440" w:hanging="360"/>
+      </w:pPr>
+      <w:rPr>
+        <w:rFonts w:ascii="Courier New" w:hAnsi="Courier New" w:hint="default"/>
+        <w:sz w:val="20"/>
+      </w:rPr>
+    </w:lvl>
+    <w:lvl w:ilvl="2" w:tentative="1">
+      <w:start w:val="1"/>
+      <w:numFmt w:val="bullet"/>
+      <w:lvlText w:val=""/>
+      <w:lvlJc w:val="left"/>
+      <w:pPr>
+        <w:tabs>
+          <w:tab w:val="num" w:pos="2160"/>
+        </w:tabs>
+        <w:ind w:left="2160" w:hanging="360"/>
+      </w:pPr>
+      <w:rPr>
+        <w:rFonts w:ascii="Wingdings" w:hAnsi="Wingdings" w:hint="default"/>
+        <w:sz w:val="20"/>
+      </w:rPr>
+    </w:lvl>
+    <w:lvl w:ilvl="3" w:tentative="1">
+      <w:start w:val="1"/>
+      <w:numFmt w:val="bullet"/>
+      <w:lvlText w:val=""/>
+      <w:lvlJc w:val="left"/>
+      <w:pPr>
+        <w:tabs>
+          <w:tab w:val="num" w:pos="2880"/>
+        </w:tabs>
+        <w:ind w:left="2880" w:hanging="360"/>
+      </w:pPr>
+      <w:rPr>
+        <w:rFonts w:ascii="Wingdings" w:hAnsi="Wingdings" w:hint="default"/>
+        <w:sz w:val="20"/>
+      </w:rPr>
+    </w:lvl>
+    <w:lvl w:ilvl="4" w:tentative="1">
+      <w:start w:val="1"/>
+      <w:numFmt w:val="bullet"/>
+      <w:lvlText w:val=""/>
+      <w:lvlJc w:val="left"/>
+      <w:pPr>
+        <w:tabs>
+          <w:tab w:val="num" w:pos="3600"/>
+        </w:tabs>
+        <w:ind w:left="3600" w:hanging="360"/>
+      </w:pPr>
+      <w:rPr>
+        <w:rFonts w:ascii="Wingdings" w:hAnsi="Wingdings" w:hint="default"/>
+        <w:sz w:val="20"/>
+      </w:rPr>
+    </w:lvl>
+    <w:lvl w:ilvl="5" w:tentative="1">
+      <w:start w:val="1"/>
+      <w:numFmt w:val="bullet"/>
+      <w:lvlText w:val=""/>
+      <w:lvlJc w:val="left"/>
+      <w:pPr>
+        <w:tabs>
+          <w:tab w:val="num" w:pos="4320"/>
+        </w:tabs>
+        <w:ind w:left="4320" w:hanging="360"/>
+      </w:pPr>
+      <w:rPr>
+        <w:rFonts w:ascii="Wingdings" w:hAnsi="Wingdings" w:hint="default"/>
+        <w:sz w:val="20"/>
+      </w:rPr>
+    </w:lvl>
+    <w:lvl w:ilvl="6" w:tentative="1">
+      <w:start w:val="1"/>
+      <w:numFmt w:val="bullet"/>
+      <w:lvlText w:val=""/>
+      <w:lvlJc w:val="left"/>
+      <w:pPr>
+        <w:tabs>
+          <w:tab w:val="num" w:pos="5040"/>
+        </w:tabs>
+        <w:ind w:left="5040" w:hanging="360"/>
+      </w:pPr>
+      <w:rPr>
+        <w:rFonts w:ascii="Wingdings" w:hAnsi="Wingdings" w:hint="default"/>
+        <w:sz w:val="20"/>
+      </w:rPr>
+    </w:lvl>
+    <w:lvl w:ilvl="7" w:tentative="1">
+      <w:start w:val="1"/>
+      <w:numFmt w:val="bullet"/>
+      <w:lvlText w:val=""/>
+      <w:lvlJc w:val="left"/>
+      <w:pPr>
+        <w:tabs>
+          <w:tab w:val="num" w:pos="5760"/>
+        </w:tabs>
+        <w:ind w:left="5760" w:hanging="360"/>
+      </w:pPr>
+      <w:rPr>
+        <w:rFonts w:ascii="Wingdings" w:hAnsi="Wingdings" w:hint="default"/>
+        <w:sz w:val="20"/>
+      </w:rPr>
+    </w:lvl>
+    <w:lvl w:ilvl="8" w:tentative="1">
+      <w:start w:val="1"/>
+      <w:numFmt w:val="bullet"/>
+      <w:lvlText w:val=""/>
+      <w:lvlJc w:val="left"/>
+      <w:pPr>
+        <w:tabs>
+          <w:tab w:val="num" w:pos="6480"/>
+        </w:tabs>
+        <w:ind w:left="6480" w:hanging="360"/>
+      </w:pPr>
+      <w:rPr>
+        <w:rFonts w:ascii="Wingdings" w:hAnsi="Wingdings" w:hint="default"/>
+        <w:sz w:val="20"/>
+      </w:rPr>
+    </w:lvl>
+  </w:abstractNum>
+  <w:abstractNum w:abstractNumId="2" w15:restartNumberingAfterBreak="0">
     <w:nsid w:val="1994764D"/>
     <w:multiLevelType w:val="multilevel"/>
     <w:tmpl w:val="9726143A"/>
@@ -1314,7 +2760,7 @@
       </w:rPr>
     </w:lvl>
   </w:abstractNum>
-  <w:abstractNum w:abstractNumId="2" w15:restartNumberingAfterBreak="0">
+  <w:abstractNum w:abstractNumId="3" w15:restartNumberingAfterBreak="0">
     <w:nsid w:val="19A86F2A"/>
     <w:multiLevelType w:val="multilevel"/>
     <w:tmpl w:val="EC0641B8"/>
@@ -1463,7 +2909,7 @@
       </w:rPr>
     </w:lvl>
   </w:abstractNum>
-  <w:abstractNum w:abstractNumId="3" w15:restartNumberingAfterBreak="0">
+  <w:abstractNum w:abstractNumId="4" w15:restartNumberingAfterBreak="0">
     <w:nsid w:val="1C2F60D6"/>
     <w:multiLevelType w:val="multilevel"/>
     <w:tmpl w:val="660A0A48"/>
@@ -1612,7 +3058,156 @@
       </w:rPr>
     </w:lvl>
   </w:abstractNum>
-  <w:abstractNum w:abstractNumId="4" w15:restartNumberingAfterBreak="0">
+  <w:abstractNum w:abstractNumId="5" w15:restartNumberingAfterBreak="0">
+    <w:nsid w:val="20F46AAE"/>
+    <w:multiLevelType w:val="multilevel"/>
+    <w:tmpl w:val="B784CC4A"/>
+    <w:lvl w:ilvl="0">
+      <w:start w:val="1"/>
+      <w:numFmt w:val="bullet"/>
+      <w:lvlText w:val=""/>
+      <w:lvlJc w:val="left"/>
+      <w:pPr>
+        <w:tabs>
+          <w:tab w:val="num" w:pos="720"/>
+        </w:tabs>
+        <w:ind w:left="720" w:hanging="360"/>
+      </w:pPr>
+      <w:rPr>
+        <w:rFonts w:ascii="Symbol" w:hAnsi="Symbol" w:hint="default"/>
+        <w:sz w:val="20"/>
+      </w:rPr>
+    </w:lvl>
+    <w:lvl w:ilvl="1" w:tentative="1">
+      <w:start w:val="1"/>
+      <w:numFmt w:val="bullet"/>
+      <w:lvlText w:val="o"/>
+      <w:lvlJc w:val="left"/>
+      <w:pPr>
+        <w:tabs>
+          <w:tab w:val="num" w:pos="1440"/>
+        </w:tabs>
+        <w:ind w:left="1440" w:hanging="360"/>
+      </w:pPr>
+      <w:rPr>
+        <w:rFonts w:ascii="Courier New" w:hAnsi="Courier New" w:hint="default"/>
+        <w:sz w:val="20"/>
+      </w:rPr>
+    </w:lvl>
+    <w:lvl w:ilvl="2" w:tentative="1">
+      <w:start w:val="1"/>
+      <w:numFmt w:val="bullet"/>
+      <w:lvlText w:val=""/>
+      <w:lvlJc w:val="left"/>
+      <w:pPr>
+        <w:tabs>
+          <w:tab w:val="num" w:pos="2160"/>
+        </w:tabs>
+        <w:ind w:left="2160" w:hanging="360"/>
+      </w:pPr>
+      <w:rPr>
+        <w:rFonts w:ascii="Wingdings" w:hAnsi="Wingdings" w:hint="default"/>
+        <w:sz w:val="20"/>
+      </w:rPr>
+    </w:lvl>
+    <w:lvl w:ilvl="3" w:tentative="1">
+      <w:start w:val="1"/>
+      <w:numFmt w:val="bullet"/>
+      <w:lvlText w:val=""/>
+      <w:lvlJc w:val="left"/>
+      <w:pPr>
+        <w:tabs>
+          <w:tab w:val="num" w:pos="2880"/>
+        </w:tabs>
+        <w:ind w:left="2880" w:hanging="360"/>
+      </w:pPr>
+      <w:rPr>
+        <w:rFonts w:ascii="Wingdings" w:hAnsi="Wingdings" w:hint="default"/>
+        <w:sz w:val="20"/>
+      </w:rPr>
+    </w:lvl>
+    <w:lvl w:ilvl="4" w:tentative="1">
+      <w:start w:val="1"/>
+      <w:numFmt w:val="bullet"/>
+      <w:lvlText w:val=""/>
+      <w:lvlJc w:val="left"/>
+      <w:pPr>
+        <w:tabs>
+          <w:tab w:val="num" w:pos="3600"/>
+        </w:tabs>
+        <w:ind w:left="3600" w:hanging="360"/>
+      </w:pPr>
+      <w:rPr>
+        <w:rFonts w:ascii="Wingdings" w:hAnsi="Wingdings" w:hint="default"/>
+        <w:sz w:val="20"/>
+      </w:rPr>
+    </w:lvl>
+    <w:lvl w:ilvl="5" w:tentative="1">
+      <w:start w:val="1"/>
+      <w:numFmt w:val="bullet"/>
+      <w:lvlText w:val=""/>
+      <w:lvlJc w:val="left"/>
+      <w:pPr>
+        <w:tabs>
+          <w:tab w:val="num" w:pos="4320"/>
+        </w:tabs>
+        <w:ind w:left="4320" w:hanging="360"/>
+      </w:pPr>
+      <w:rPr>
+        <w:rFonts w:ascii="Wingdings" w:hAnsi="Wingdings" w:hint="default"/>
+        <w:sz w:val="20"/>
+      </w:rPr>
+    </w:lvl>
+    <w:lvl w:ilvl="6" w:tentative="1">
+      <w:start w:val="1"/>
+      <w:numFmt w:val="bullet"/>
+      <w:lvlText w:val=""/>
+      <w:lvlJc w:val="left"/>
+      <w:pPr>
+        <w:tabs>
+          <w:tab w:val="num" w:pos="5040"/>
+        </w:tabs>
+        <w:ind w:left="5040" w:hanging="360"/>
+      </w:pPr>
+      <w:rPr>
+        <w:rFonts w:ascii="Wingdings" w:hAnsi="Wingdings" w:hint="default"/>
+        <w:sz w:val="20"/>
+      </w:rPr>
+    </w:lvl>
+    <w:lvl w:ilvl="7" w:tentative="1">
+      <w:start w:val="1"/>
+      <w:numFmt w:val="bullet"/>
+      <w:lvlText w:val=""/>
+      <w:lvlJc w:val="left"/>
+      <w:pPr>
+        <w:tabs>
+          <w:tab w:val="num" w:pos="5760"/>
+        </w:tabs>
+        <w:ind w:left="5760" w:hanging="360"/>
+      </w:pPr>
+      <w:rPr>
+        <w:rFonts w:ascii="Wingdings" w:hAnsi="Wingdings" w:hint="default"/>
+        <w:sz w:val="20"/>
+      </w:rPr>
+    </w:lvl>
+    <w:lvl w:ilvl="8" w:tentative="1">
+      <w:start w:val="1"/>
+      <w:numFmt w:val="bullet"/>
+      <w:lvlText w:val=""/>
+      <w:lvlJc w:val="left"/>
+      <w:pPr>
+        <w:tabs>
+          <w:tab w:val="num" w:pos="6480"/>
+        </w:tabs>
+        <w:ind w:left="6480" w:hanging="360"/>
+      </w:pPr>
+      <w:rPr>
+        <w:rFonts w:ascii="Wingdings" w:hAnsi="Wingdings" w:hint="default"/>
+        <w:sz w:val="20"/>
+      </w:rPr>
+    </w:lvl>
+  </w:abstractNum>
+  <w:abstractNum w:abstractNumId="6" w15:restartNumberingAfterBreak="0">
     <w:nsid w:val="23181231"/>
     <w:multiLevelType w:val="multilevel"/>
     <w:tmpl w:val="1C706162"/>
@@ -1725,26 +3320,1096 @@
       </w:pPr>
     </w:lvl>
   </w:abstractNum>
+  <w:abstractNum w:abstractNumId="7" w15:restartNumberingAfterBreak="0">
+    <w:nsid w:val="282846F4"/>
+    <w:multiLevelType w:val="multilevel"/>
+    <w:tmpl w:val="7E68E492"/>
+    <w:lvl w:ilvl="0">
+      <w:start w:val="1"/>
+      <w:numFmt w:val="bullet"/>
+      <w:lvlText w:val=""/>
+      <w:lvlJc w:val="left"/>
+      <w:pPr>
+        <w:tabs>
+          <w:tab w:val="num" w:pos="720"/>
+        </w:tabs>
+        <w:ind w:left="720" w:hanging="360"/>
+      </w:pPr>
+      <w:rPr>
+        <w:rFonts w:ascii="Symbol" w:hAnsi="Symbol" w:hint="default"/>
+        <w:sz w:val="20"/>
+      </w:rPr>
+    </w:lvl>
+    <w:lvl w:ilvl="1">
+      <w:start w:val="1"/>
+      <w:numFmt w:val="bullet"/>
+      <w:lvlText w:val="o"/>
+      <w:lvlJc w:val="left"/>
+      <w:pPr>
+        <w:tabs>
+          <w:tab w:val="num" w:pos="1440"/>
+        </w:tabs>
+        <w:ind w:left="1440" w:hanging="360"/>
+      </w:pPr>
+      <w:rPr>
+        <w:rFonts w:ascii="Courier New" w:hAnsi="Courier New" w:hint="default"/>
+        <w:sz w:val="20"/>
+      </w:rPr>
+    </w:lvl>
+    <w:lvl w:ilvl="2" w:tentative="1">
+      <w:start w:val="1"/>
+      <w:numFmt w:val="bullet"/>
+      <w:lvlText w:val=""/>
+      <w:lvlJc w:val="left"/>
+      <w:pPr>
+        <w:tabs>
+          <w:tab w:val="num" w:pos="2160"/>
+        </w:tabs>
+        <w:ind w:left="2160" w:hanging="360"/>
+      </w:pPr>
+      <w:rPr>
+        <w:rFonts w:ascii="Wingdings" w:hAnsi="Wingdings" w:hint="default"/>
+        <w:sz w:val="20"/>
+      </w:rPr>
+    </w:lvl>
+    <w:lvl w:ilvl="3" w:tentative="1">
+      <w:start w:val="1"/>
+      <w:numFmt w:val="bullet"/>
+      <w:lvlText w:val=""/>
+      <w:lvlJc w:val="left"/>
+      <w:pPr>
+        <w:tabs>
+          <w:tab w:val="num" w:pos="2880"/>
+        </w:tabs>
+        <w:ind w:left="2880" w:hanging="360"/>
+      </w:pPr>
+      <w:rPr>
+        <w:rFonts w:ascii="Wingdings" w:hAnsi="Wingdings" w:hint="default"/>
+        <w:sz w:val="20"/>
+      </w:rPr>
+    </w:lvl>
+    <w:lvl w:ilvl="4" w:tentative="1">
+      <w:start w:val="1"/>
+      <w:numFmt w:val="bullet"/>
+      <w:lvlText w:val=""/>
+      <w:lvlJc w:val="left"/>
+      <w:pPr>
+        <w:tabs>
+          <w:tab w:val="num" w:pos="3600"/>
+        </w:tabs>
+        <w:ind w:left="3600" w:hanging="360"/>
+      </w:pPr>
+      <w:rPr>
+        <w:rFonts w:ascii="Wingdings" w:hAnsi="Wingdings" w:hint="default"/>
+        <w:sz w:val="20"/>
+      </w:rPr>
+    </w:lvl>
+    <w:lvl w:ilvl="5" w:tentative="1">
+      <w:start w:val="1"/>
+      <w:numFmt w:val="bullet"/>
+      <w:lvlText w:val=""/>
+      <w:lvlJc w:val="left"/>
+      <w:pPr>
+        <w:tabs>
+          <w:tab w:val="num" w:pos="4320"/>
+        </w:tabs>
+        <w:ind w:left="4320" w:hanging="360"/>
+      </w:pPr>
+      <w:rPr>
+        <w:rFonts w:ascii="Wingdings" w:hAnsi="Wingdings" w:hint="default"/>
+        <w:sz w:val="20"/>
+      </w:rPr>
+    </w:lvl>
+    <w:lvl w:ilvl="6" w:tentative="1">
+      <w:start w:val="1"/>
+      <w:numFmt w:val="bullet"/>
+      <w:lvlText w:val=""/>
+      <w:lvlJc w:val="left"/>
+      <w:pPr>
+        <w:tabs>
+          <w:tab w:val="num" w:pos="5040"/>
+        </w:tabs>
+        <w:ind w:left="5040" w:hanging="360"/>
+      </w:pPr>
+      <w:rPr>
+        <w:rFonts w:ascii="Wingdings" w:hAnsi="Wingdings" w:hint="default"/>
+        <w:sz w:val="20"/>
+      </w:rPr>
+    </w:lvl>
+    <w:lvl w:ilvl="7" w:tentative="1">
+      <w:start w:val="1"/>
+      <w:numFmt w:val="bullet"/>
+      <w:lvlText w:val=""/>
+      <w:lvlJc w:val="left"/>
+      <w:pPr>
+        <w:tabs>
+          <w:tab w:val="num" w:pos="5760"/>
+        </w:tabs>
+        <w:ind w:left="5760" w:hanging="360"/>
+      </w:pPr>
+      <w:rPr>
+        <w:rFonts w:ascii="Wingdings" w:hAnsi="Wingdings" w:hint="default"/>
+        <w:sz w:val="20"/>
+      </w:rPr>
+    </w:lvl>
+    <w:lvl w:ilvl="8" w:tentative="1">
+      <w:start w:val="1"/>
+      <w:numFmt w:val="bullet"/>
+      <w:lvlText w:val=""/>
+      <w:lvlJc w:val="left"/>
+      <w:pPr>
+        <w:tabs>
+          <w:tab w:val="num" w:pos="6480"/>
+        </w:tabs>
+        <w:ind w:left="6480" w:hanging="360"/>
+      </w:pPr>
+      <w:rPr>
+        <w:rFonts w:ascii="Wingdings" w:hAnsi="Wingdings" w:hint="default"/>
+        <w:sz w:val="20"/>
+      </w:rPr>
+    </w:lvl>
+  </w:abstractNum>
+  <w:abstractNum w:abstractNumId="8" w15:restartNumberingAfterBreak="0">
+    <w:nsid w:val="2CE75827"/>
+    <w:multiLevelType w:val="multilevel"/>
+    <w:tmpl w:val="26DC2372"/>
+    <w:lvl w:ilvl="0">
+      <w:start w:val="1"/>
+      <w:numFmt w:val="bullet"/>
+      <w:lvlText w:val=""/>
+      <w:lvlJc w:val="left"/>
+      <w:pPr>
+        <w:tabs>
+          <w:tab w:val="num" w:pos="720"/>
+        </w:tabs>
+        <w:ind w:left="720" w:hanging="360"/>
+      </w:pPr>
+      <w:rPr>
+        <w:rFonts w:ascii="Symbol" w:hAnsi="Symbol" w:hint="default"/>
+        <w:sz w:val="20"/>
+      </w:rPr>
+    </w:lvl>
+    <w:lvl w:ilvl="1" w:tentative="1">
+      <w:start w:val="1"/>
+      <w:numFmt w:val="bullet"/>
+      <w:lvlText w:val="o"/>
+      <w:lvlJc w:val="left"/>
+      <w:pPr>
+        <w:tabs>
+          <w:tab w:val="num" w:pos="1440"/>
+        </w:tabs>
+        <w:ind w:left="1440" w:hanging="360"/>
+      </w:pPr>
+      <w:rPr>
+        <w:rFonts w:ascii="Courier New" w:hAnsi="Courier New" w:hint="default"/>
+        <w:sz w:val="20"/>
+      </w:rPr>
+    </w:lvl>
+    <w:lvl w:ilvl="2" w:tentative="1">
+      <w:start w:val="1"/>
+      <w:numFmt w:val="bullet"/>
+      <w:lvlText w:val=""/>
+      <w:lvlJc w:val="left"/>
+      <w:pPr>
+        <w:tabs>
+          <w:tab w:val="num" w:pos="2160"/>
+        </w:tabs>
+        <w:ind w:left="2160" w:hanging="360"/>
+      </w:pPr>
+      <w:rPr>
+        <w:rFonts w:ascii="Wingdings" w:hAnsi="Wingdings" w:hint="default"/>
+        <w:sz w:val="20"/>
+      </w:rPr>
+    </w:lvl>
+    <w:lvl w:ilvl="3" w:tentative="1">
+      <w:start w:val="1"/>
+      <w:numFmt w:val="bullet"/>
+      <w:lvlText w:val=""/>
+      <w:lvlJc w:val="left"/>
+      <w:pPr>
+        <w:tabs>
+          <w:tab w:val="num" w:pos="2880"/>
+        </w:tabs>
+        <w:ind w:left="2880" w:hanging="360"/>
+      </w:pPr>
+      <w:rPr>
+        <w:rFonts w:ascii="Wingdings" w:hAnsi="Wingdings" w:hint="default"/>
+        <w:sz w:val="20"/>
+      </w:rPr>
+    </w:lvl>
+    <w:lvl w:ilvl="4" w:tentative="1">
+      <w:start w:val="1"/>
+      <w:numFmt w:val="bullet"/>
+      <w:lvlText w:val=""/>
+      <w:lvlJc w:val="left"/>
+      <w:pPr>
+        <w:tabs>
+          <w:tab w:val="num" w:pos="3600"/>
+        </w:tabs>
+        <w:ind w:left="3600" w:hanging="360"/>
+      </w:pPr>
+      <w:rPr>
+        <w:rFonts w:ascii="Wingdings" w:hAnsi="Wingdings" w:hint="default"/>
+        <w:sz w:val="20"/>
+      </w:rPr>
+    </w:lvl>
+    <w:lvl w:ilvl="5" w:tentative="1">
+      <w:start w:val="1"/>
+      <w:numFmt w:val="bullet"/>
+      <w:lvlText w:val=""/>
+      <w:lvlJc w:val="left"/>
+      <w:pPr>
+        <w:tabs>
+          <w:tab w:val="num" w:pos="4320"/>
+        </w:tabs>
+        <w:ind w:left="4320" w:hanging="360"/>
+      </w:pPr>
+      <w:rPr>
+        <w:rFonts w:ascii="Wingdings" w:hAnsi="Wingdings" w:hint="default"/>
+        <w:sz w:val="20"/>
+      </w:rPr>
+    </w:lvl>
+    <w:lvl w:ilvl="6" w:tentative="1">
+      <w:start w:val="1"/>
+      <w:numFmt w:val="bullet"/>
+      <w:lvlText w:val=""/>
+      <w:lvlJc w:val="left"/>
+      <w:pPr>
+        <w:tabs>
+          <w:tab w:val="num" w:pos="5040"/>
+        </w:tabs>
+        <w:ind w:left="5040" w:hanging="360"/>
+      </w:pPr>
+      <w:rPr>
+        <w:rFonts w:ascii="Wingdings" w:hAnsi="Wingdings" w:hint="default"/>
+        <w:sz w:val="20"/>
+      </w:rPr>
+    </w:lvl>
+    <w:lvl w:ilvl="7" w:tentative="1">
+      <w:start w:val="1"/>
+      <w:numFmt w:val="bullet"/>
+      <w:lvlText w:val=""/>
+      <w:lvlJc w:val="left"/>
+      <w:pPr>
+        <w:tabs>
+          <w:tab w:val="num" w:pos="5760"/>
+        </w:tabs>
+        <w:ind w:left="5760" w:hanging="360"/>
+      </w:pPr>
+      <w:rPr>
+        <w:rFonts w:ascii="Wingdings" w:hAnsi="Wingdings" w:hint="default"/>
+        <w:sz w:val="20"/>
+      </w:rPr>
+    </w:lvl>
+    <w:lvl w:ilvl="8" w:tentative="1">
+      <w:start w:val="1"/>
+      <w:numFmt w:val="bullet"/>
+      <w:lvlText w:val=""/>
+      <w:lvlJc w:val="left"/>
+      <w:pPr>
+        <w:tabs>
+          <w:tab w:val="num" w:pos="6480"/>
+        </w:tabs>
+        <w:ind w:left="6480" w:hanging="360"/>
+      </w:pPr>
+      <w:rPr>
+        <w:rFonts w:ascii="Wingdings" w:hAnsi="Wingdings" w:hint="default"/>
+        <w:sz w:val="20"/>
+      </w:rPr>
+    </w:lvl>
+  </w:abstractNum>
+  <w:abstractNum w:abstractNumId="9" w15:restartNumberingAfterBreak="0">
+    <w:nsid w:val="3939759B"/>
+    <w:multiLevelType w:val="multilevel"/>
+    <w:tmpl w:val="F816F26E"/>
+    <w:lvl w:ilvl="0">
+      <w:start w:val="1"/>
+      <w:numFmt w:val="bullet"/>
+      <w:lvlText w:val=""/>
+      <w:lvlJc w:val="left"/>
+      <w:pPr>
+        <w:tabs>
+          <w:tab w:val="num" w:pos="720"/>
+        </w:tabs>
+        <w:ind w:left="720" w:hanging="360"/>
+      </w:pPr>
+      <w:rPr>
+        <w:rFonts w:ascii="Symbol" w:hAnsi="Symbol" w:hint="default"/>
+        <w:sz w:val="20"/>
+      </w:rPr>
+    </w:lvl>
+    <w:lvl w:ilvl="1">
+      <w:start w:val="1"/>
+      <w:numFmt w:val="bullet"/>
+      <w:lvlText w:val="o"/>
+      <w:lvlJc w:val="left"/>
+      <w:pPr>
+        <w:tabs>
+          <w:tab w:val="num" w:pos="1440"/>
+        </w:tabs>
+        <w:ind w:left="1440" w:hanging="360"/>
+      </w:pPr>
+      <w:rPr>
+        <w:rFonts w:ascii="Courier New" w:hAnsi="Courier New" w:hint="default"/>
+        <w:sz w:val="20"/>
+      </w:rPr>
+    </w:lvl>
+    <w:lvl w:ilvl="2" w:tentative="1">
+      <w:start w:val="1"/>
+      <w:numFmt w:val="bullet"/>
+      <w:lvlText w:val=""/>
+      <w:lvlJc w:val="left"/>
+      <w:pPr>
+        <w:tabs>
+          <w:tab w:val="num" w:pos="2160"/>
+        </w:tabs>
+        <w:ind w:left="2160" w:hanging="360"/>
+      </w:pPr>
+      <w:rPr>
+        <w:rFonts w:ascii="Wingdings" w:hAnsi="Wingdings" w:hint="default"/>
+        <w:sz w:val="20"/>
+      </w:rPr>
+    </w:lvl>
+    <w:lvl w:ilvl="3" w:tentative="1">
+      <w:start w:val="1"/>
+      <w:numFmt w:val="bullet"/>
+      <w:lvlText w:val=""/>
+      <w:lvlJc w:val="left"/>
+      <w:pPr>
+        <w:tabs>
+          <w:tab w:val="num" w:pos="2880"/>
+        </w:tabs>
+        <w:ind w:left="2880" w:hanging="360"/>
+      </w:pPr>
+      <w:rPr>
+        <w:rFonts w:ascii="Wingdings" w:hAnsi="Wingdings" w:hint="default"/>
+        <w:sz w:val="20"/>
+      </w:rPr>
+    </w:lvl>
+    <w:lvl w:ilvl="4" w:tentative="1">
+      <w:start w:val="1"/>
+      <w:numFmt w:val="bullet"/>
+      <w:lvlText w:val=""/>
+      <w:lvlJc w:val="left"/>
+      <w:pPr>
+        <w:tabs>
+          <w:tab w:val="num" w:pos="3600"/>
+        </w:tabs>
+        <w:ind w:left="3600" w:hanging="360"/>
+      </w:pPr>
+      <w:rPr>
+        <w:rFonts w:ascii="Wingdings" w:hAnsi="Wingdings" w:hint="default"/>
+        <w:sz w:val="20"/>
+      </w:rPr>
+    </w:lvl>
+    <w:lvl w:ilvl="5" w:tentative="1">
+      <w:start w:val="1"/>
+      <w:numFmt w:val="bullet"/>
+      <w:lvlText w:val=""/>
+      <w:lvlJc w:val="left"/>
+      <w:pPr>
+        <w:tabs>
+          <w:tab w:val="num" w:pos="4320"/>
+        </w:tabs>
+        <w:ind w:left="4320" w:hanging="360"/>
+      </w:pPr>
+      <w:rPr>
+        <w:rFonts w:ascii="Wingdings" w:hAnsi="Wingdings" w:hint="default"/>
+        <w:sz w:val="20"/>
+      </w:rPr>
+    </w:lvl>
+    <w:lvl w:ilvl="6" w:tentative="1">
+      <w:start w:val="1"/>
+      <w:numFmt w:val="bullet"/>
+      <w:lvlText w:val=""/>
+      <w:lvlJc w:val="left"/>
+      <w:pPr>
+        <w:tabs>
+          <w:tab w:val="num" w:pos="5040"/>
+        </w:tabs>
+        <w:ind w:left="5040" w:hanging="360"/>
+      </w:pPr>
+      <w:rPr>
+        <w:rFonts w:ascii="Wingdings" w:hAnsi="Wingdings" w:hint="default"/>
+        <w:sz w:val="20"/>
+      </w:rPr>
+    </w:lvl>
+    <w:lvl w:ilvl="7" w:tentative="1">
+      <w:start w:val="1"/>
+      <w:numFmt w:val="bullet"/>
+      <w:lvlText w:val=""/>
+      <w:lvlJc w:val="left"/>
+      <w:pPr>
+        <w:tabs>
+          <w:tab w:val="num" w:pos="5760"/>
+        </w:tabs>
+        <w:ind w:left="5760" w:hanging="360"/>
+      </w:pPr>
+      <w:rPr>
+        <w:rFonts w:ascii="Wingdings" w:hAnsi="Wingdings" w:hint="default"/>
+        <w:sz w:val="20"/>
+      </w:rPr>
+    </w:lvl>
+    <w:lvl w:ilvl="8" w:tentative="1">
+      <w:start w:val="1"/>
+      <w:numFmt w:val="bullet"/>
+      <w:lvlText w:val=""/>
+      <w:lvlJc w:val="left"/>
+      <w:pPr>
+        <w:tabs>
+          <w:tab w:val="num" w:pos="6480"/>
+        </w:tabs>
+        <w:ind w:left="6480" w:hanging="360"/>
+      </w:pPr>
+      <w:rPr>
+        <w:rFonts w:ascii="Wingdings" w:hAnsi="Wingdings" w:hint="default"/>
+        <w:sz w:val="20"/>
+      </w:rPr>
+    </w:lvl>
+  </w:abstractNum>
+  <w:abstractNum w:abstractNumId="10" w15:restartNumberingAfterBreak="0">
+    <w:nsid w:val="4AF85FFC"/>
+    <w:multiLevelType w:val="multilevel"/>
+    <w:tmpl w:val="47FAC53C"/>
+    <w:lvl w:ilvl="0">
+      <w:start w:val="1"/>
+      <w:numFmt w:val="bullet"/>
+      <w:lvlText w:val=""/>
+      <w:lvlJc w:val="left"/>
+      <w:pPr>
+        <w:tabs>
+          <w:tab w:val="num" w:pos="720"/>
+        </w:tabs>
+        <w:ind w:left="720" w:hanging="360"/>
+      </w:pPr>
+      <w:rPr>
+        <w:rFonts w:ascii="Symbol" w:hAnsi="Symbol" w:hint="default"/>
+        <w:sz w:val="20"/>
+      </w:rPr>
+    </w:lvl>
+    <w:lvl w:ilvl="1" w:tentative="1">
+      <w:start w:val="1"/>
+      <w:numFmt w:val="bullet"/>
+      <w:lvlText w:val="o"/>
+      <w:lvlJc w:val="left"/>
+      <w:pPr>
+        <w:tabs>
+          <w:tab w:val="num" w:pos="1440"/>
+        </w:tabs>
+        <w:ind w:left="1440" w:hanging="360"/>
+      </w:pPr>
+      <w:rPr>
+        <w:rFonts w:ascii="Courier New" w:hAnsi="Courier New" w:hint="default"/>
+        <w:sz w:val="20"/>
+      </w:rPr>
+    </w:lvl>
+    <w:lvl w:ilvl="2" w:tentative="1">
+      <w:start w:val="1"/>
+      <w:numFmt w:val="bullet"/>
+      <w:lvlText w:val=""/>
+      <w:lvlJc w:val="left"/>
+      <w:pPr>
+        <w:tabs>
+          <w:tab w:val="num" w:pos="2160"/>
+        </w:tabs>
+        <w:ind w:left="2160" w:hanging="360"/>
+      </w:pPr>
+      <w:rPr>
+        <w:rFonts w:ascii="Wingdings" w:hAnsi="Wingdings" w:hint="default"/>
+        <w:sz w:val="20"/>
+      </w:rPr>
+    </w:lvl>
+    <w:lvl w:ilvl="3" w:tentative="1">
+      <w:start w:val="1"/>
+      <w:numFmt w:val="bullet"/>
+      <w:lvlText w:val=""/>
+      <w:lvlJc w:val="left"/>
+      <w:pPr>
+        <w:tabs>
+          <w:tab w:val="num" w:pos="2880"/>
+        </w:tabs>
+        <w:ind w:left="2880" w:hanging="360"/>
+      </w:pPr>
+      <w:rPr>
+        <w:rFonts w:ascii="Wingdings" w:hAnsi="Wingdings" w:hint="default"/>
+        <w:sz w:val="20"/>
+      </w:rPr>
+    </w:lvl>
+    <w:lvl w:ilvl="4" w:tentative="1">
+      <w:start w:val="1"/>
+      <w:numFmt w:val="bullet"/>
+      <w:lvlText w:val=""/>
+      <w:lvlJc w:val="left"/>
+      <w:pPr>
+        <w:tabs>
+          <w:tab w:val="num" w:pos="3600"/>
+        </w:tabs>
+        <w:ind w:left="3600" w:hanging="360"/>
+      </w:pPr>
+      <w:rPr>
+        <w:rFonts w:ascii="Wingdings" w:hAnsi="Wingdings" w:hint="default"/>
+        <w:sz w:val="20"/>
+      </w:rPr>
+    </w:lvl>
+    <w:lvl w:ilvl="5" w:tentative="1">
+      <w:start w:val="1"/>
+      <w:numFmt w:val="bullet"/>
+      <w:lvlText w:val=""/>
+      <w:lvlJc w:val="left"/>
+      <w:pPr>
+        <w:tabs>
+          <w:tab w:val="num" w:pos="4320"/>
+        </w:tabs>
+        <w:ind w:left="4320" w:hanging="360"/>
+      </w:pPr>
+      <w:rPr>
+        <w:rFonts w:ascii="Wingdings" w:hAnsi="Wingdings" w:hint="default"/>
+        <w:sz w:val="20"/>
+      </w:rPr>
+    </w:lvl>
+    <w:lvl w:ilvl="6" w:tentative="1">
+      <w:start w:val="1"/>
+      <w:numFmt w:val="bullet"/>
+      <w:lvlText w:val=""/>
+      <w:lvlJc w:val="left"/>
+      <w:pPr>
+        <w:tabs>
+          <w:tab w:val="num" w:pos="5040"/>
+        </w:tabs>
+        <w:ind w:left="5040" w:hanging="360"/>
+      </w:pPr>
+      <w:rPr>
+        <w:rFonts w:ascii="Wingdings" w:hAnsi="Wingdings" w:hint="default"/>
+        <w:sz w:val="20"/>
+      </w:rPr>
+    </w:lvl>
+    <w:lvl w:ilvl="7" w:tentative="1">
+      <w:start w:val="1"/>
+      <w:numFmt w:val="bullet"/>
+      <w:lvlText w:val=""/>
+      <w:lvlJc w:val="left"/>
+      <w:pPr>
+        <w:tabs>
+          <w:tab w:val="num" w:pos="5760"/>
+        </w:tabs>
+        <w:ind w:left="5760" w:hanging="360"/>
+      </w:pPr>
+      <w:rPr>
+        <w:rFonts w:ascii="Wingdings" w:hAnsi="Wingdings" w:hint="default"/>
+        <w:sz w:val="20"/>
+      </w:rPr>
+    </w:lvl>
+    <w:lvl w:ilvl="8" w:tentative="1">
+      <w:start w:val="1"/>
+      <w:numFmt w:val="bullet"/>
+      <w:lvlText w:val=""/>
+      <w:lvlJc w:val="left"/>
+      <w:pPr>
+        <w:tabs>
+          <w:tab w:val="num" w:pos="6480"/>
+        </w:tabs>
+        <w:ind w:left="6480" w:hanging="360"/>
+      </w:pPr>
+      <w:rPr>
+        <w:rFonts w:ascii="Wingdings" w:hAnsi="Wingdings" w:hint="default"/>
+        <w:sz w:val="20"/>
+      </w:rPr>
+    </w:lvl>
+  </w:abstractNum>
+  <w:abstractNum w:abstractNumId="11" w15:restartNumberingAfterBreak="0">
+    <w:nsid w:val="5B410C5B"/>
+    <w:multiLevelType w:val="multilevel"/>
+    <w:tmpl w:val="44D2AC72"/>
+    <w:lvl w:ilvl="0">
+      <w:start w:val="1"/>
+      <w:numFmt w:val="bullet"/>
+      <w:lvlText w:val=""/>
+      <w:lvlJc w:val="left"/>
+      <w:pPr>
+        <w:tabs>
+          <w:tab w:val="num" w:pos="720"/>
+        </w:tabs>
+        <w:ind w:left="720" w:hanging="360"/>
+      </w:pPr>
+      <w:rPr>
+        <w:rFonts w:ascii="Symbol" w:hAnsi="Symbol" w:hint="default"/>
+        <w:sz w:val="20"/>
+      </w:rPr>
+    </w:lvl>
+    <w:lvl w:ilvl="1" w:tentative="1">
+      <w:start w:val="1"/>
+      <w:numFmt w:val="bullet"/>
+      <w:lvlText w:val="o"/>
+      <w:lvlJc w:val="left"/>
+      <w:pPr>
+        <w:tabs>
+          <w:tab w:val="num" w:pos="1440"/>
+        </w:tabs>
+        <w:ind w:left="1440" w:hanging="360"/>
+      </w:pPr>
+      <w:rPr>
+        <w:rFonts w:ascii="Courier New" w:hAnsi="Courier New" w:hint="default"/>
+        <w:sz w:val="20"/>
+      </w:rPr>
+    </w:lvl>
+    <w:lvl w:ilvl="2" w:tentative="1">
+      <w:start w:val="1"/>
+      <w:numFmt w:val="bullet"/>
+      <w:lvlText w:val=""/>
+      <w:lvlJc w:val="left"/>
+      <w:pPr>
+        <w:tabs>
+          <w:tab w:val="num" w:pos="2160"/>
+        </w:tabs>
+        <w:ind w:left="2160" w:hanging="360"/>
+      </w:pPr>
+      <w:rPr>
+        <w:rFonts w:ascii="Wingdings" w:hAnsi="Wingdings" w:hint="default"/>
+        <w:sz w:val="20"/>
+      </w:rPr>
+    </w:lvl>
+    <w:lvl w:ilvl="3" w:tentative="1">
+      <w:start w:val="1"/>
+      <w:numFmt w:val="bullet"/>
+      <w:lvlText w:val=""/>
+      <w:lvlJc w:val="left"/>
+      <w:pPr>
+        <w:tabs>
+          <w:tab w:val="num" w:pos="2880"/>
+        </w:tabs>
+        <w:ind w:left="2880" w:hanging="360"/>
+      </w:pPr>
+      <w:rPr>
+        <w:rFonts w:ascii="Wingdings" w:hAnsi="Wingdings" w:hint="default"/>
+        <w:sz w:val="20"/>
+      </w:rPr>
+    </w:lvl>
+    <w:lvl w:ilvl="4" w:tentative="1">
+      <w:start w:val="1"/>
+      <w:numFmt w:val="bullet"/>
+      <w:lvlText w:val=""/>
+      <w:lvlJc w:val="left"/>
+      <w:pPr>
+        <w:tabs>
+          <w:tab w:val="num" w:pos="3600"/>
+        </w:tabs>
+        <w:ind w:left="3600" w:hanging="360"/>
+      </w:pPr>
+      <w:rPr>
+        <w:rFonts w:ascii="Wingdings" w:hAnsi="Wingdings" w:hint="default"/>
+        <w:sz w:val="20"/>
+      </w:rPr>
+    </w:lvl>
+    <w:lvl w:ilvl="5" w:tentative="1">
+      <w:start w:val="1"/>
+      <w:numFmt w:val="bullet"/>
+      <w:lvlText w:val=""/>
+      <w:lvlJc w:val="left"/>
+      <w:pPr>
+        <w:tabs>
+          <w:tab w:val="num" w:pos="4320"/>
+        </w:tabs>
+        <w:ind w:left="4320" w:hanging="360"/>
+      </w:pPr>
+      <w:rPr>
+        <w:rFonts w:ascii="Wingdings" w:hAnsi="Wingdings" w:hint="default"/>
+        <w:sz w:val="20"/>
+      </w:rPr>
+    </w:lvl>
+    <w:lvl w:ilvl="6" w:tentative="1">
+      <w:start w:val="1"/>
+      <w:numFmt w:val="bullet"/>
+      <w:lvlText w:val=""/>
+      <w:lvlJc w:val="left"/>
+      <w:pPr>
+        <w:tabs>
+          <w:tab w:val="num" w:pos="5040"/>
+        </w:tabs>
+        <w:ind w:left="5040" w:hanging="360"/>
+      </w:pPr>
+      <w:rPr>
+        <w:rFonts w:ascii="Wingdings" w:hAnsi="Wingdings" w:hint="default"/>
+        <w:sz w:val="20"/>
+      </w:rPr>
+    </w:lvl>
+    <w:lvl w:ilvl="7" w:tentative="1">
+      <w:start w:val="1"/>
+      <w:numFmt w:val="bullet"/>
+      <w:lvlText w:val=""/>
+      <w:lvlJc w:val="left"/>
+      <w:pPr>
+        <w:tabs>
+          <w:tab w:val="num" w:pos="5760"/>
+        </w:tabs>
+        <w:ind w:left="5760" w:hanging="360"/>
+      </w:pPr>
+      <w:rPr>
+        <w:rFonts w:ascii="Wingdings" w:hAnsi="Wingdings" w:hint="default"/>
+        <w:sz w:val="20"/>
+      </w:rPr>
+    </w:lvl>
+    <w:lvl w:ilvl="8" w:tentative="1">
+      <w:start w:val="1"/>
+      <w:numFmt w:val="bullet"/>
+      <w:lvlText w:val=""/>
+      <w:lvlJc w:val="left"/>
+      <w:pPr>
+        <w:tabs>
+          <w:tab w:val="num" w:pos="6480"/>
+        </w:tabs>
+        <w:ind w:left="6480" w:hanging="360"/>
+      </w:pPr>
+      <w:rPr>
+        <w:rFonts w:ascii="Wingdings" w:hAnsi="Wingdings" w:hint="default"/>
+        <w:sz w:val="20"/>
+      </w:rPr>
+    </w:lvl>
+  </w:abstractNum>
+  <w:abstractNum w:abstractNumId="12" w15:restartNumberingAfterBreak="0">
+    <w:nsid w:val="5BDE214B"/>
+    <w:multiLevelType w:val="multilevel"/>
+    <w:tmpl w:val="C0A89822"/>
+    <w:lvl w:ilvl="0">
+      <w:start w:val="1"/>
+      <w:numFmt w:val="bullet"/>
+      <w:lvlText w:val=""/>
+      <w:lvlJc w:val="left"/>
+      <w:pPr>
+        <w:tabs>
+          <w:tab w:val="num" w:pos="720"/>
+        </w:tabs>
+        <w:ind w:left="720" w:hanging="360"/>
+      </w:pPr>
+      <w:rPr>
+        <w:rFonts w:ascii="Symbol" w:hAnsi="Symbol" w:hint="default"/>
+        <w:sz w:val="20"/>
+      </w:rPr>
+    </w:lvl>
+    <w:lvl w:ilvl="1" w:tentative="1">
+      <w:start w:val="1"/>
+      <w:numFmt w:val="bullet"/>
+      <w:lvlText w:val="o"/>
+      <w:lvlJc w:val="left"/>
+      <w:pPr>
+        <w:tabs>
+          <w:tab w:val="num" w:pos="1440"/>
+        </w:tabs>
+        <w:ind w:left="1440" w:hanging="360"/>
+      </w:pPr>
+      <w:rPr>
+        <w:rFonts w:ascii="Courier New" w:hAnsi="Courier New" w:hint="default"/>
+        <w:sz w:val="20"/>
+      </w:rPr>
+    </w:lvl>
+    <w:lvl w:ilvl="2" w:tentative="1">
+      <w:start w:val="1"/>
+      <w:numFmt w:val="bullet"/>
+      <w:lvlText w:val=""/>
+      <w:lvlJc w:val="left"/>
+      <w:pPr>
+        <w:tabs>
+          <w:tab w:val="num" w:pos="2160"/>
+        </w:tabs>
+        <w:ind w:left="2160" w:hanging="360"/>
+      </w:pPr>
+      <w:rPr>
+        <w:rFonts w:ascii="Wingdings" w:hAnsi="Wingdings" w:hint="default"/>
+        <w:sz w:val="20"/>
+      </w:rPr>
+    </w:lvl>
+    <w:lvl w:ilvl="3" w:tentative="1">
+      <w:start w:val="1"/>
+      <w:numFmt w:val="bullet"/>
+      <w:lvlText w:val=""/>
+      <w:lvlJc w:val="left"/>
+      <w:pPr>
+        <w:tabs>
+          <w:tab w:val="num" w:pos="2880"/>
+        </w:tabs>
+        <w:ind w:left="2880" w:hanging="360"/>
+      </w:pPr>
+      <w:rPr>
+        <w:rFonts w:ascii="Wingdings" w:hAnsi="Wingdings" w:hint="default"/>
+        <w:sz w:val="20"/>
+      </w:rPr>
+    </w:lvl>
+    <w:lvl w:ilvl="4" w:tentative="1">
+      <w:start w:val="1"/>
+      <w:numFmt w:val="bullet"/>
+      <w:lvlText w:val=""/>
+      <w:lvlJc w:val="left"/>
+      <w:pPr>
+        <w:tabs>
+          <w:tab w:val="num" w:pos="3600"/>
+        </w:tabs>
+        <w:ind w:left="3600" w:hanging="360"/>
+      </w:pPr>
+      <w:rPr>
+        <w:rFonts w:ascii="Wingdings" w:hAnsi="Wingdings" w:hint="default"/>
+        <w:sz w:val="20"/>
+      </w:rPr>
+    </w:lvl>
+    <w:lvl w:ilvl="5" w:tentative="1">
+      <w:start w:val="1"/>
+      <w:numFmt w:val="bullet"/>
+      <w:lvlText w:val=""/>
+      <w:lvlJc w:val="left"/>
+      <w:pPr>
+        <w:tabs>
+          <w:tab w:val="num" w:pos="4320"/>
+        </w:tabs>
+        <w:ind w:left="4320" w:hanging="360"/>
+      </w:pPr>
+      <w:rPr>
+        <w:rFonts w:ascii="Wingdings" w:hAnsi="Wingdings" w:hint="default"/>
+        <w:sz w:val="20"/>
+      </w:rPr>
+    </w:lvl>
+    <w:lvl w:ilvl="6" w:tentative="1">
+      <w:start w:val="1"/>
+      <w:numFmt w:val="bullet"/>
+      <w:lvlText w:val=""/>
+      <w:lvlJc w:val="left"/>
+      <w:pPr>
+        <w:tabs>
+          <w:tab w:val="num" w:pos="5040"/>
+        </w:tabs>
+        <w:ind w:left="5040" w:hanging="360"/>
+      </w:pPr>
+      <w:rPr>
+        <w:rFonts w:ascii="Wingdings" w:hAnsi="Wingdings" w:hint="default"/>
+        <w:sz w:val="20"/>
+      </w:rPr>
+    </w:lvl>
+    <w:lvl w:ilvl="7" w:tentative="1">
+      <w:start w:val="1"/>
+      <w:numFmt w:val="bullet"/>
+      <w:lvlText w:val=""/>
+      <w:lvlJc w:val="left"/>
+      <w:pPr>
+        <w:tabs>
+          <w:tab w:val="num" w:pos="5760"/>
+        </w:tabs>
+        <w:ind w:left="5760" w:hanging="360"/>
+      </w:pPr>
+      <w:rPr>
+        <w:rFonts w:ascii="Wingdings" w:hAnsi="Wingdings" w:hint="default"/>
+        <w:sz w:val="20"/>
+      </w:rPr>
+    </w:lvl>
+    <w:lvl w:ilvl="8" w:tentative="1">
+      <w:start w:val="1"/>
+      <w:numFmt w:val="bullet"/>
+      <w:lvlText w:val=""/>
+      <w:lvlJc w:val="left"/>
+      <w:pPr>
+        <w:tabs>
+          <w:tab w:val="num" w:pos="6480"/>
+        </w:tabs>
+        <w:ind w:left="6480" w:hanging="360"/>
+      </w:pPr>
+      <w:rPr>
+        <w:rFonts w:ascii="Wingdings" w:hAnsi="Wingdings" w:hint="default"/>
+        <w:sz w:val="20"/>
+      </w:rPr>
+    </w:lvl>
+  </w:abstractNum>
+  <w:abstractNum w:abstractNumId="13" w15:restartNumberingAfterBreak="0">
+    <w:nsid w:val="6BC650A0"/>
+    <w:multiLevelType w:val="multilevel"/>
+    <w:tmpl w:val="A6CA3080"/>
+    <w:lvl w:ilvl="0">
+      <w:start w:val="1"/>
+      <w:numFmt w:val="bullet"/>
+      <w:lvlText w:val=""/>
+      <w:lvlJc w:val="left"/>
+      <w:pPr>
+        <w:tabs>
+          <w:tab w:val="num" w:pos="720"/>
+        </w:tabs>
+        <w:ind w:left="720" w:hanging="360"/>
+      </w:pPr>
+      <w:rPr>
+        <w:rFonts w:ascii="Symbol" w:hAnsi="Symbol" w:hint="default"/>
+        <w:sz w:val="20"/>
+      </w:rPr>
+    </w:lvl>
+    <w:lvl w:ilvl="1">
+      <w:start w:val="1"/>
+      <w:numFmt w:val="bullet"/>
+      <w:lvlText w:val="o"/>
+      <w:lvlJc w:val="left"/>
+      <w:pPr>
+        <w:tabs>
+          <w:tab w:val="num" w:pos="1440"/>
+        </w:tabs>
+        <w:ind w:left="1440" w:hanging="360"/>
+      </w:pPr>
+      <w:rPr>
+        <w:rFonts w:ascii="Courier New" w:hAnsi="Courier New" w:hint="default"/>
+        <w:sz w:val="20"/>
+      </w:rPr>
+    </w:lvl>
+    <w:lvl w:ilvl="2" w:tentative="1">
+      <w:start w:val="1"/>
+      <w:numFmt w:val="bullet"/>
+      <w:lvlText w:val=""/>
+      <w:lvlJc w:val="left"/>
+      <w:pPr>
+        <w:tabs>
+          <w:tab w:val="num" w:pos="2160"/>
+        </w:tabs>
+        <w:ind w:left="2160" w:hanging="360"/>
+      </w:pPr>
+      <w:rPr>
+        <w:rFonts w:ascii="Wingdings" w:hAnsi="Wingdings" w:hint="default"/>
+        <w:sz w:val="20"/>
+      </w:rPr>
+    </w:lvl>
+    <w:lvl w:ilvl="3" w:tentative="1">
+      <w:start w:val="1"/>
+      <w:numFmt w:val="bullet"/>
+      <w:lvlText w:val=""/>
+      <w:lvlJc w:val="left"/>
+      <w:pPr>
+        <w:tabs>
+          <w:tab w:val="num" w:pos="2880"/>
+        </w:tabs>
+        <w:ind w:left="2880" w:hanging="360"/>
+      </w:pPr>
+      <w:rPr>
+        <w:rFonts w:ascii="Wingdings" w:hAnsi="Wingdings" w:hint="default"/>
+        <w:sz w:val="20"/>
+      </w:rPr>
+    </w:lvl>
+    <w:lvl w:ilvl="4" w:tentative="1">
+      <w:start w:val="1"/>
+      <w:numFmt w:val="bullet"/>
+      <w:lvlText w:val=""/>
+      <w:lvlJc w:val="left"/>
+      <w:pPr>
+        <w:tabs>
+          <w:tab w:val="num" w:pos="3600"/>
+        </w:tabs>
+        <w:ind w:left="3600" w:hanging="360"/>
+      </w:pPr>
+      <w:rPr>
+        <w:rFonts w:ascii="Wingdings" w:hAnsi="Wingdings" w:hint="default"/>
+        <w:sz w:val="20"/>
+      </w:rPr>
+    </w:lvl>
+    <w:lvl w:ilvl="5" w:tentative="1">
+      <w:start w:val="1"/>
+      <w:numFmt w:val="bullet"/>
+      <w:lvlText w:val=""/>
+      <w:lvlJc w:val="left"/>
+      <w:pPr>
+        <w:tabs>
+          <w:tab w:val="num" w:pos="4320"/>
+        </w:tabs>
+        <w:ind w:left="4320" w:hanging="360"/>
+      </w:pPr>
+      <w:rPr>
+        <w:rFonts w:ascii="Wingdings" w:hAnsi="Wingdings" w:hint="default"/>
+        <w:sz w:val="20"/>
+      </w:rPr>
+    </w:lvl>
+    <w:lvl w:ilvl="6" w:tentative="1">
+      <w:start w:val="1"/>
+      <w:numFmt w:val="bullet"/>
+      <w:lvlText w:val=""/>
+      <w:lvlJc w:val="left"/>
+      <w:pPr>
+        <w:tabs>
+          <w:tab w:val="num" w:pos="5040"/>
+        </w:tabs>
+        <w:ind w:left="5040" w:hanging="360"/>
+      </w:pPr>
+      <w:rPr>
+        <w:rFonts w:ascii="Wingdings" w:hAnsi="Wingdings" w:hint="default"/>
+        <w:sz w:val="20"/>
+      </w:rPr>
+    </w:lvl>
+    <w:lvl w:ilvl="7" w:tentative="1">
+      <w:start w:val="1"/>
+      <w:numFmt w:val="bullet"/>
+      <w:lvlText w:val=""/>
+      <w:lvlJc w:val="left"/>
+      <w:pPr>
+        <w:tabs>
+          <w:tab w:val="num" w:pos="5760"/>
+        </w:tabs>
+        <w:ind w:left="5760" w:hanging="360"/>
+      </w:pPr>
+      <w:rPr>
+        <w:rFonts w:ascii="Wingdings" w:hAnsi="Wingdings" w:hint="default"/>
+        <w:sz w:val="20"/>
+      </w:rPr>
+    </w:lvl>
+    <w:lvl w:ilvl="8" w:tentative="1">
+      <w:start w:val="1"/>
+      <w:numFmt w:val="bullet"/>
+      <w:lvlText w:val=""/>
+      <w:lvlJc w:val="left"/>
+      <w:pPr>
+        <w:tabs>
+          <w:tab w:val="num" w:pos="6480"/>
+        </w:tabs>
+        <w:ind w:left="6480" w:hanging="360"/>
+      </w:pPr>
+      <w:rPr>
+        <w:rFonts w:ascii="Wingdings" w:hAnsi="Wingdings" w:hint="default"/>
+        <w:sz w:val="20"/>
+      </w:rPr>
+    </w:lvl>
+  </w:abstractNum>
   <w:num w:numId="1" w16cid:durableId="843200976">
-    <w:abstractNumId w:val="1"/>
+    <w:abstractNumId w:val="2"/>
   </w:num>
   <w:num w:numId="2" w16cid:durableId="1165977950">
-    <w:abstractNumId w:val="4"/>
+    <w:abstractNumId w:val="6"/>
   </w:num>
   <w:num w:numId="3" w16cid:durableId="1446920516">
     <w:abstractNumId w:val="0"/>
   </w:num>
   <w:num w:numId="4" w16cid:durableId="1802308545">
+    <w:abstractNumId w:val="4"/>
+  </w:num>
+  <w:num w:numId="5" w16cid:durableId="1192382282">
     <w:abstractNumId w:val="3"/>
   </w:num>
-  <w:num w:numId="5" w16cid:durableId="1192382282">
-    <w:abstractNumId w:val="2"/>
+  <w:num w:numId="6" w16cid:durableId="1703893288">
+    <w:abstractNumId w:val="12"/>
+  </w:num>
+  <w:num w:numId="7" w16cid:durableId="1625578007">
+    <w:abstractNumId w:val="5"/>
+  </w:num>
+  <w:num w:numId="8" w16cid:durableId="61561476">
+    <w:abstractNumId w:val="11"/>
+  </w:num>
+  <w:num w:numId="9" w16cid:durableId="1988589009">
+    <w:abstractNumId w:val="13"/>
+  </w:num>
+  <w:num w:numId="10" w16cid:durableId="1624269561">
+    <w:abstractNumId w:val="1"/>
+  </w:num>
+  <w:num w:numId="11" w16cid:durableId="722559954">
+    <w:abstractNumId w:val="7"/>
+  </w:num>
+  <w:num w:numId="12" w16cid:durableId="474952147">
+    <w:abstractNumId w:val="8"/>
+  </w:num>
+  <w:num w:numId="13" w16cid:durableId="174850569">
+    <w:abstractNumId w:val="9"/>
+  </w:num>
+  <w:num w:numId="14" w16cid:durableId="377632912">
+    <w:abstractNumId w:val="10"/>
   </w:num>
 </w:numbering>
 </file>
 
 <file path=word/styles.xml><?xml version="1.0" encoding="utf-8"?>
-<w:styles xmlns:mc="http://schemas.openxmlformats.org/markup-compatibility/2006" xmlns:r="http://schemas.openxmlformats.org/officeDocument/2006/relationships" xmlns:w="http://schemas.openxmlformats.org/wordprocessingml/2006/main" xmlns:w14="http://schemas.microsoft.com/office/word/2010/wordml" xmlns:w15="http://schemas.microsoft.com/office/word/2012/wordml" xmlns:w16cex="http://schemas.microsoft.com/office/word/2018/wordml/cex" xmlns:w16cid="http://schemas.microsoft.com/office/word/2016/wordml/cid" xmlns:w16="http://schemas.microsoft.com/office/word/2018/wordml" xmlns:w16du="http://schemas.microsoft.com/office/word/2023/wordml/word16du" xmlns:w16sdtdh="http://schemas.microsoft.com/office/word/2020/wordml/sdtdatahash" xmlns:w16sdtfl="http://schemas.microsoft.com/office/word/2024/wordml/sdtformatlock" xmlns:w16se="http://schemas.microsoft.com/office/word/2015/wordml/symex" mc:Ignorable="w14 w15 w16se w16cid w16 w16cex w16sdtdh w16sdtfl w16du">
+<w:styles xmlns:mc="http://schemas.openxmlformats.org/markup-compatibility/2006" xmlns:r="http://schemas.openxmlformats.org/officeDocument/2006/relationships" xmlns:w="http://schemas.openxmlformats.org/wordprocessingml/2006/main" xmlns:w14="http://schemas.microsoft.com/office/word/2010/wordml" xmlns:w15="http://schemas.microsoft.com/office/word/2012/wordml" xmlns:w16cex="http://schemas.microsoft.com/office/word/2018/wordml/cex" xmlns:w16cid="http://schemas.microsoft.com/office/word/2016/wordml/cid" xmlns:w16="http://schemas.microsoft.com/office/word/2018/wordml" xmlns:w16sdtdh="http://schemas.microsoft.com/office/word/2020/wordml/sdtdatahash" xmlns:w16se="http://schemas.microsoft.com/office/word/2015/wordml/symex" mc:Ignorable="w14 w15 w16se w16cid w16 w16cex w16sdtdh">
   <w:docDefaults>
     <w:rPrDefault>
       <w:rPr>
@@ -2345,6 +5010,7 @@
   <w:style w:type="character" w:default="1" w:styleId="a0">
     <w:name w:val="Default Paragraph Font"/>
     <w:uiPriority w:val="1"/>
+    <w:semiHidden/>
     <w:unhideWhenUsed/>
   </w:style>
   <w:style w:type="table" w:default="1" w:styleId="a1">

</xml_diff>